<commit_message>
deleted films and series and added browse, which should hopefully get the job done today
</commit_message>
<xml_diff>
--- a/docs/Documentation.docx
+++ b/docs/Documentation.docx
@@ -46,13 +46,14 @@
           <w:bCs/>
           <w:sz w:val="48"/>
           <w:szCs w:val="48"/>
+          <w:highlight w:val="none"/>
           <w14:ligatures w14:val="none"/>
         </w:rPr>
       </w:r>
     </w:p>
     <w:p>
       <w:pPr>
-        <w:pStyle w:val="853"/>
+        <w:pStyle w:val="947"/>
         <w:pBdr/>
         <w:spacing/>
         <w:ind/>
@@ -84,34 +85,7 @@
           <w:bCs/>
           <w:sz w:val="42"/>
           <w:szCs w:val="42"/>
-          <w:highlight w:val="none"/>
           <w14:ligatures w14:val="none"/>
-        </w:rPr>
-      </w:r>
-      <w:r>
-        <w:rPr>
-          <w:rFonts w:ascii="Arial" w:hAnsi="Arial" w:cs="Arial"/>
-          <w:b/>
-          <w:bCs/>
-          <w:sz w:val="42"/>
-          <w:szCs w:val="42"/>
-          <w:highlight w:val="none"/>
-          <w14:ligatures w14:val="none"/>
-        </w:rPr>
-      </w:r>
-      <w:r>
-        <w:rPr>
-          <w:rFonts w:ascii="Arial" w:hAnsi="Arial" w:eastAsia="Arial" w:cs="Arial"/>
-        </w:rPr>
-      </w:r>
-      <w:r>
-        <w:rPr>
-          <w:rFonts w:ascii="Arial" w:hAnsi="Arial" w:cs="Arial"/>
-        </w:rPr>
-      </w:r>
-      <w:r>
-        <w:rPr>
-          <w:rFonts w:ascii="Arial" w:hAnsi="Arial" w:cs="Arial"/>
         </w:rPr>
       </w:r>
       <w:r>
@@ -127,7 +101,7 @@
     </w:p>
     <w:p>
       <w:pPr>
-        <w:pStyle w:val="854"/>
+        <w:pStyle w:val="948"/>
         <w:pBdr/>
         <w:spacing/>
         <w:ind/>
@@ -160,28 +134,6 @@
           <w:szCs w:val="36"/>
         </w:rPr>
       </w:r>
-      <w:r>
-        <w:rPr>
-          <w:rFonts w:ascii="Arial" w:hAnsi="Arial" w:cs="Arial"/>
-          <w:sz w:val="36"/>
-          <w:szCs w:val="36"/>
-        </w:rPr>
-      </w:r>
-      <w:r>
-        <w:rPr>
-          <w:rFonts w:ascii="Arial" w:hAnsi="Arial" w:cs="Arial"/>
-          <w:sz w:val="36"/>
-          <w:szCs w:val="36"/>
-        </w:rPr>
-      </w:r>
-      <w:r>
-        <w:rPr>
-          <w:rFonts w:ascii="Arial" w:hAnsi="Arial" w:cs="Arial"/>
-          <w:sz w:val="36"/>
-          <w:szCs w:val="36"/>
-        </w:rPr>
-      </w:r>
-      <w:r/>
       <w:r>
         <w:rPr>
           <w:rFonts w:ascii="Arial" w:hAnsi="Arial" w:cs="Arial"/>
@@ -218,12 +170,6 @@
       </w:r>
       <w:r>
         <w:rPr>
-          <w:sz w:val="24"/>
-          <w:szCs w:val="24"/>
-        </w:rPr>
-      </w:r>
-      <w:r>
-        <w:rPr>
           <w:rFonts w:ascii="Arial" w:hAnsi="Arial" w:eastAsia="Arial" w:cs="Arial"/>
           <w:color w:val="000000"/>
           <w:sz w:val="24"/>
@@ -272,13 +218,6 @@
         </w:rPr>
         <w:t xml:space="preserve"> </w:t>
       </w:r>
-      <w:r/>
-      <w:r>
-        <w:rPr>
-          <w:sz w:val="24"/>
-          <w:szCs w:val="24"/>
-        </w:rPr>
-      </w:r>
       <w:r>
         <w:rPr>
           <w:rFonts w:ascii="Arial" w:hAnsi="Arial" w:cs="Arial"/>
@@ -287,6 +226,12 @@
           <w:highlight w:val="none"/>
         </w:rPr>
       </w:r>
+      <w:r>
+        <w:rPr>
+          <w:sz w:val="24"/>
+          <w:szCs w:val="24"/>
+        </w:rPr>
+      </w:r>
     </w:p>
     <w:p>
       <w:pPr>
@@ -305,7 +250,14 @@
           <w:sz w:val="24"/>
           <w:szCs w:val="24"/>
         </w:rPr>
-        <w:t xml:space="preserve">This project serves as an opportunity to demonstrate my skills, and if I perform well, I may be put as project leader to fully implementing this in real life. That would grant me access to their official API and full video content, rather than relying on YouTube trailers like on this project.</w:t>
+        <w:t xml:space="preserve">This project serves as an opportunity</w:t>
+      </w:r>
+      <w:r>
+        <w:rPr>
+          <w:sz w:val="24"/>
+          <w:szCs w:val="24"/>
+        </w:rPr>
+        <w:t xml:space="preserve"> to demonstrate my skills, and if I perform well, I may be put as project leader to fully implementing this in real life. That would grant me access to their official API and full video content, rather than relying on YouTube trailers like on this project.</w:t>
       </w:r>
       <w:r>
         <w:rPr>
@@ -314,28 +266,43 @@
           <w:highlight w:val="none"/>
         </w:rPr>
       </w:r>
-      <w:r/>
-    </w:p>
-    <w:p>
-      <w:pPr>
-        <w:pBdr/>
-        <w:spacing/>
-        <w:ind/>
+      <w:r>
         <w:rPr>
           <w:rFonts w:ascii="Arial" w:hAnsi="Arial" w:cs="Arial"/>
           <w:sz w:val="24"/>
           <w:szCs w:val="24"/>
           <w:highlight w:val="none"/>
         </w:rPr>
-      </w:pPr>
-      <w:r>
+      </w:r>
+    </w:p>
+    <w:p>
+      <w:pPr>
+        <w:pBdr/>
+        <w:spacing/>
+        <w:ind/>
         <w:rPr>
           <w:rFonts w:ascii="Arial" w:hAnsi="Arial" w:cs="Arial"/>
           <w:sz w:val="24"/>
           <w:szCs w:val="24"/>
           <w:highlight w:val="none"/>
         </w:rPr>
+      </w:pPr>
+      <w:r>
+        <w:rPr>
+          <w:rFonts w:ascii="Arial" w:hAnsi="Arial" w:cs="Arial"/>
+          <w:sz w:val="24"/>
+          <w:szCs w:val="24"/>
+          <w:highlight w:val="none"/>
+        </w:rPr>
         <w:t xml:space="preserve">The goals are as follows;</w:t>
+      </w:r>
+      <w:r>
+        <w:rPr>
+          <w:rFonts w:ascii="Arial" w:hAnsi="Arial" w:cs="Arial"/>
+          <w:sz w:val="24"/>
+          <w:szCs w:val="24"/>
+          <w:highlight w:val="none"/>
+        </w:rPr>
       </w:r>
       <w:r>
         <w:rPr>
@@ -613,7 +580,7 @@
     </w:p>
     <w:p>
       <w:pPr>
-        <w:pStyle w:val="854"/>
+        <w:pStyle w:val="948"/>
         <w:pBdr/>
         <w:spacing/>
         <w:ind/>
@@ -744,7 +711,7 @@
     </w:p>
     <w:p>
       <w:pPr>
-        <w:pStyle w:val="916"/>
+        <w:pStyle w:val="1010"/>
         <w:numPr>
           <w:ilvl w:val="0"/>
           <w:numId w:val="55"/>
@@ -795,7 +762,7 @@
     </w:p>
     <w:p>
       <w:pPr>
-        <w:pStyle w:val="916"/>
+        <w:pStyle w:val="1010"/>
         <w:numPr>
           <w:ilvl w:val="0"/>
           <w:numId w:val="52"/>
@@ -893,6 +860,12 @@
           <w14:ligatures w14:val="none"/>
         </w:rPr>
       </w:r>
+      <w:r>
+        <w:rPr>
+          <w:rFonts w:ascii="Arial" w:hAnsi="Arial" w:cs="Arial"/>
+          <w14:ligatures w14:val="none"/>
+        </w:rPr>
+      </w:r>
     </w:p>
     <w:p>
       <w:pPr>
@@ -937,7 +910,7 @@
     </w:p>
     <w:p>
       <w:pPr>
-        <w:pStyle w:val="916"/>
+        <w:pStyle w:val="1010"/>
         <w:numPr>
           <w:ilvl w:val="0"/>
           <w:numId w:val="53"/>
@@ -979,7 +952,7 @@
     </w:p>
     <w:p>
       <w:pPr>
-        <w:pStyle w:val="916"/>
+        <w:pStyle w:val="1010"/>
         <w:numPr>
           <w:ilvl w:val="1"/>
           <w:numId w:val="7"/>
@@ -1027,7 +1000,7 @@
     </w:p>
     <w:p>
       <w:pPr>
-        <w:pStyle w:val="916"/>
+        <w:pStyle w:val="1010"/>
         <w:numPr>
           <w:ilvl w:val="1"/>
           <w:numId w:val="7"/>
@@ -1071,7 +1044,7 @@
     </w:p>
     <w:p>
       <w:pPr>
-        <w:pStyle w:val="916"/>
+        <w:pStyle w:val="1010"/>
         <w:numPr>
           <w:ilvl w:val="1"/>
           <w:numId w:val="7"/>
@@ -1112,7 +1085,7 @@
     </w:p>
     <w:p>
       <w:pPr>
-        <w:pStyle w:val="916"/>
+        <w:pStyle w:val="1010"/>
         <w:numPr>
           <w:ilvl w:val="2"/>
           <w:numId w:val="8"/>
@@ -1153,7 +1126,7 @@
     </w:p>
     <w:p>
       <w:pPr>
-        <w:pStyle w:val="916"/>
+        <w:pStyle w:val="1010"/>
         <w:numPr>
           <w:ilvl w:val="2"/>
           <w:numId w:val="8"/>
@@ -1194,7 +1167,7 @@
     </w:p>
     <w:p>
       <w:pPr>
-        <w:pStyle w:val="916"/>
+        <w:pStyle w:val="1010"/>
         <w:numPr>
           <w:ilvl w:val="2"/>
           <w:numId w:val="8"/>
@@ -1273,7 +1246,7 @@
     </w:p>
     <w:p>
       <w:pPr>
-        <w:pStyle w:val="854"/>
+        <w:pStyle w:val="948"/>
         <w:pBdr/>
         <w:spacing/>
         <w:ind/>
@@ -1405,7 +1378,7 @@
     </w:p>
     <w:p>
       <w:pPr>
-        <w:pStyle w:val="916"/>
+        <w:pStyle w:val="1010"/>
         <w:numPr>
           <w:ilvl w:val="0"/>
           <w:numId w:val="9"/>
@@ -1432,7 +1405,7 @@
       </w:r>
       <w:r>
         <w:rPr>
-          <w:rFonts w:ascii="Arial" w:hAnsi="Arial" w:eastAsia="Arial" w:cs="Arial"/>
+          <w:rFonts w:ascii="Arial" w:hAnsi="Arial" w:cs="Arial"/>
         </w:rPr>
       </w:r>
       <w:r>
@@ -1443,7 +1416,7 @@
     </w:p>
     <w:p>
       <w:pPr>
-        <w:pStyle w:val="916"/>
+        <w:pStyle w:val="1010"/>
         <w:numPr>
           <w:ilvl w:val="0"/>
           <w:numId w:val="9"/>
@@ -1470,7 +1443,7 @@
       </w:r>
       <w:r>
         <w:rPr>
-          <w:rFonts w:ascii="Arial" w:hAnsi="Arial" w:eastAsia="Arial" w:cs="Arial"/>
+          <w:rFonts w:ascii="Arial" w:hAnsi="Arial" w:cs="Arial"/>
         </w:rPr>
       </w:r>
       <w:r>
@@ -1481,7 +1454,7 @@
     </w:p>
     <w:p>
       <w:pPr>
-        <w:pStyle w:val="916"/>
+        <w:pStyle w:val="1010"/>
         <w:numPr>
           <w:ilvl w:val="0"/>
           <w:numId w:val="10"/>
@@ -1527,7 +1500,7 @@
       </w:r>
       <w:r>
         <w:rPr>
-          <w:rFonts w:ascii="Arial" w:hAnsi="Arial" w:eastAsia="Arial" w:cs="Arial"/>
+          <w:rFonts w:ascii="Arial" w:hAnsi="Arial" w:cs="Arial"/>
         </w:rPr>
       </w:r>
       <w:r>
@@ -1602,7 +1575,7 @@
     </w:p>
     <w:p>
       <w:pPr>
-        <w:pStyle w:val="916"/>
+        <w:pStyle w:val="1010"/>
         <w:numPr>
           <w:ilvl w:val="0"/>
           <w:numId w:val="12"/>
@@ -1630,7 +1603,6 @@
       </w:r>
       <w:r>
         <w:rPr>
-          <w:rFonts w:ascii="Arial" w:hAnsi="Arial" w:cs="Arial"/>
           <w:sz w:val="24"/>
           <w:szCs w:val="24"/>
         </w:rPr>
@@ -1644,7 +1616,7 @@
     </w:p>
     <w:p>
       <w:pPr>
-        <w:pStyle w:val="916"/>
+        <w:pStyle w:val="1010"/>
         <w:numPr>
           <w:ilvl w:val="0"/>
           <w:numId w:val="12"/>
@@ -1672,7 +1644,6 @@
       </w:r>
       <w:r>
         <w:rPr>
-          <w:rFonts w:ascii="Arial" w:hAnsi="Arial" w:cs="Arial"/>
           <w:sz w:val="24"/>
           <w:szCs w:val="24"/>
         </w:rPr>
@@ -1686,7 +1657,7 @@
     </w:p>
     <w:p>
       <w:pPr>
-        <w:pStyle w:val="916"/>
+        <w:pStyle w:val="1010"/>
         <w:numPr>
           <w:ilvl w:val="0"/>
           <w:numId w:val="12"/>
@@ -1714,7 +1685,6 @@
       </w:r>
       <w:r>
         <w:rPr>
-          <w:rFonts w:ascii="Arial" w:hAnsi="Arial" w:cs="Arial"/>
           <w:sz w:val="24"/>
           <w:szCs w:val="24"/>
         </w:rPr>
@@ -1728,7 +1698,7 @@
     </w:p>
     <w:p>
       <w:pPr>
-        <w:pStyle w:val="916"/>
+        <w:pStyle w:val="1010"/>
         <w:numPr>
           <w:ilvl w:val="0"/>
           <w:numId w:val="12"/>
@@ -1756,7 +1726,6 @@
       </w:r>
       <w:r>
         <w:rPr>
-          <w:rFonts w:ascii="Arial" w:hAnsi="Arial" w:cs="Arial"/>
           <w:sz w:val="24"/>
           <w:szCs w:val="24"/>
         </w:rPr>
@@ -1912,6 +1881,13 @@
           <w:szCs w:val="24"/>
         </w:rPr>
       </w:r>
+      <w:r>
+        <w:rPr>
+          <w:rFonts w:ascii="Arial" w:hAnsi="Arial" w:cs="Arial"/>
+          <w:sz w:val="24"/>
+          <w:szCs w:val="24"/>
+        </w:rPr>
+      </w:r>
     </w:p>
     <w:p>
       <w:pPr>
@@ -1943,10 +1919,17 @@
           <w:szCs w:val="24"/>
         </w:rPr>
       </w:r>
+      <w:r>
+        <w:rPr>
+          <w:rFonts w:ascii="Arial" w:hAnsi="Arial" w:cs="Arial"/>
+          <w:sz w:val="24"/>
+          <w:szCs w:val="24"/>
+        </w:rPr>
+      </w:r>
     </w:p>
     <w:p>
       <w:pPr>
-        <w:pStyle w:val="853"/>
+        <w:pStyle w:val="947"/>
         <w:pBdr/>
         <w:spacing/>
         <w:ind/>
@@ -2013,7 +1996,7 @@
           <w:sz w:val="24"/>
           <w:szCs w:val="24"/>
         </w:rPr>
-        <w:t xml:space="preserve">Content is categorized into high-level sections such as Browse, Series, Films, Contact Us and User Account. </w:t>
+        <w:t xml:space="preserve">Content is categorized into high-level sections such as Browse, Contact Us and User Account. </w:t>
       </w:r>
       <w:r>
         <w:rPr>
@@ -2033,6 +2016,13 @@
         <w:rPr>
           <w:sz w:val="24"/>
           <w:szCs w:val="24"/>
+        </w:rPr>
+      </w:r>
+      <w:r>
+        <w:rPr>
+          <w:sz w:val="24"/>
+          <w:szCs w:val="24"/>
+          <w14:ligatures w14:val="none"/>
         </w:rPr>
       </w:r>
     </w:p>
@@ -2073,6 +2063,14 @@
           <w:szCs w:val="24"/>
         </w:rPr>
       </w:r>
+      <w:r>
+        <w:rPr>
+          <w:sz w:val="24"/>
+          <w:szCs w:val="24"/>
+          <w:highlight w:val="none"/>
+          <w14:ligatures w14:val="none"/>
+        </w:rPr>
+      </w:r>
     </w:p>
     <w:p>
       <w:pPr>
@@ -2106,7 +2104,7 @@
       </w:r>
       <w:r>
         <w:rPr>
-          <w:rFonts w:ascii="Arial" w:hAnsi="Arial" w:eastAsia="Arial" w:cs="Arial"/>
+          <w:rFonts w:ascii="Arial" w:hAnsi="Arial" w:cs="Arial"/>
           <w:sz w:val="24"/>
           <w:szCs w:val="24"/>
         </w:rPr>
@@ -2114,7 +2112,7 @@
     </w:p>
     <w:p>
       <w:pPr>
-        <w:pStyle w:val="854"/>
+        <w:pStyle w:val="948"/>
         <w:pBdr>
           <w:top w:val="none" w:color="000000" w:sz="4" w:space="0"/>
           <w:left w:val="none" w:color="000000" w:sz="4" w:space="0"/>
@@ -2151,7 +2149,7 @@
       </w:r>
       <w:r>
         <w:rPr>
-          <w:rFonts w:ascii="Arial" w:hAnsi="Arial" w:eastAsia="Arial" w:cs="Arial"/>
+          <w:rFonts w:ascii="Arial" w:hAnsi="Arial" w:cs="Arial"/>
         </w:rPr>
       </w:r>
     </w:p>
@@ -2184,7 +2182,7 @@
       </w:r>
       <w:r>
         <w:rPr>
-          <w:rFonts w:ascii="Arial" w:hAnsi="Arial" w:eastAsia="Arial" w:cs="Arial"/>
+          <w:rFonts w:ascii="Arial" w:hAnsi="Arial" w:cs="Arial"/>
         </w:rPr>
       </w:r>
     </w:p>
@@ -2220,10 +2218,44 @@
       </w:r>
       <w:r>
         <w:rPr>
+          <w:rFonts w:ascii="Arial" w:hAnsi="Arial" w:cs="Arial"/>
+          <w:sz w:val="24"/>
+          <w:szCs w:val="24"/>
+        </w:rPr>
+      </w:r>
+    </w:p>
+    <w:p>
+      <w:pPr>
+        <w:pBdr/>
+        <w:spacing/>
+        <w:ind/>
+        <w:rPr>
+          <w:rFonts w:ascii="Arial" w:hAnsi="Arial" w:cs="Arial"/>
+          <w:sz w:val="24"/>
+          <w:szCs w:val="24"/>
+        </w:rPr>
+      </w:pPr>
+      <w:r>
+        <w:rPr>
           <w:rFonts w:ascii="Arial" w:hAnsi="Arial" w:eastAsia="Arial" w:cs="Arial"/>
           <w:sz w:val="24"/>
           <w:szCs w:val="24"/>
         </w:rPr>
+        <w:t xml:space="preserve">Home </w:t>
+      </w:r>
+      <w:r>
+        <w:rPr>
+          <w:rFonts w:ascii="Arial" w:hAnsi="Arial" w:eastAsia="Arial" w:cs="Arial"/>
+          <w:sz w:val="24"/>
+          <w:szCs w:val="24"/>
+        </w:rPr>
+      </w:r>
+      <w:r>
+        <w:rPr>
+          <w:rFonts w:ascii="Arial" w:hAnsi="Arial" w:cs="Arial"/>
+          <w:sz w:val="24"/>
+          <w:szCs w:val="24"/>
+        </w:rPr>
       </w:r>
     </w:p>
     <w:p>
@@ -2243,7 +2275,6 @@
           <w:sz w:val="24"/>
           <w:szCs w:val="24"/>
         </w:rPr>
-        <w:t xml:space="preserve">Home </w:t>
       </w:r>
       <w:r>
         <w:rPr>
@@ -2251,6 +2282,19 @@
           <w:sz w:val="24"/>
           <w:szCs w:val="24"/>
         </w:rPr>
+        <w:t xml:space="preserve">├── Browse</w:t>
+      </w:r>
+      <w:r>
+        <w:rPr>
+          <w:rFonts w:ascii="Arial" w:hAnsi="Arial" w:eastAsia="Arial" w:cs="Arial"/>
+        </w:rPr>
+      </w:r>
+      <w:r>
+        <w:rPr>
+          <w:rFonts w:ascii="Arial" w:hAnsi="Arial" w:cs="Arial"/>
+          <w:sz w:val="24"/>
+          <w:szCs w:val="24"/>
+        </w:rPr>
       </w:r>
     </w:p>
     <w:p>
@@ -2260,8 +2304,6 @@
         <w:ind/>
         <w:rPr>
           <w:rFonts w:ascii="Arial" w:hAnsi="Arial" w:cs="Arial"/>
-          <w:sz w:val="24"/>
-          <w:szCs w:val="24"/>
         </w:rPr>
       </w:pPr>
       <w:r>
@@ -2270,25 +2312,72 @@
           <w:sz w:val="24"/>
           <w:szCs w:val="24"/>
         </w:rPr>
+        <w:t xml:space="preserve"> │        ├── Browse (browse.html)</w:t>
       </w:r>
+      <w:r>
+        <w:rPr>
+          <w:rFonts w:ascii="Arial" w:hAnsi="Arial" w:eastAsia="Arial" w:cs="Arial"/>
+        </w:rPr>
+      </w:r>
+      <w:r>
+        <w:rPr>
+          <w:rFonts w:ascii="Arial" w:hAnsi="Arial" w:cs="Arial"/>
+        </w:rPr>
+      </w:r>
+    </w:p>
+    <w:p>
+      <w:pPr>
+        <w:pBdr/>
+        <w:spacing/>
+        <w:ind/>
+        <w:rPr>
+          <w:rFonts w:ascii="Arial" w:hAnsi="Arial" w:cs="Arial"/>
+        </w:rPr>
+      </w:pPr>
       <w:r>
         <w:rPr>
           <w:rFonts w:ascii="Arial" w:hAnsi="Arial" w:eastAsia="Arial" w:cs="Arial"/>
           <w:sz w:val="24"/>
           <w:szCs w:val="24"/>
         </w:rPr>
-        <w:t xml:space="preserve">├── Browse</w:t>
+        <w:t xml:space="preserve"> ├── Anime Detail Page (anime.html?id=...)</w:t>
       </w:r>
+      <w:r>
+        <w:rPr>
+          <w:rFonts w:ascii="Arial" w:hAnsi="Arial" w:eastAsia="Arial" w:cs="Arial"/>
+        </w:rPr>
+      </w:r>
+      <w:r>
+        <w:rPr>
+          <w:rFonts w:ascii="Arial" w:hAnsi="Arial" w:cs="Arial"/>
+        </w:rPr>
+      </w:r>
+    </w:p>
+    <w:p>
+      <w:pPr>
+        <w:pBdr/>
+        <w:spacing/>
+        <w:ind/>
+        <w:rPr>
+          <w:rFonts w:ascii="Arial" w:hAnsi="Arial" w:cs="Arial"/>
+        </w:rPr>
+      </w:pPr>
       <w:r>
         <w:rPr>
           <w:rFonts w:ascii="Arial" w:hAnsi="Arial" w:eastAsia="Arial" w:cs="Arial"/>
           <w:sz w:val="24"/>
           <w:szCs w:val="24"/>
         </w:rPr>
+        <w:t xml:space="preserve"> ├── Player Page (watch.html?id=...)</w:t>
       </w:r>
       <w:r>
         <w:rPr>
           <w:rFonts w:ascii="Arial" w:hAnsi="Arial" w:eastAsia="Arial" w:cs="Arial"/>
+        </w:rPr>
+      </w:r>
+      <w:r>
+        <w:rPr>
+          <w:rFonts w:ascii="Arial" w:hAnsi="Arial" w:cs="Arial"/>
         </w:rPr>
       </w:r>
     </w:p>
@@ -2307,11 +2396,16 @@
           <w:sz w:val="24"/>
           <w:szCs w:val="24"/>
         </w:rPr>
-        <w:t xml:space="preserve"> │        ├── Series (series.html)</w:t>
+        <w:t xml:space="preserve">├── Search Results (search.html?q=...)</w:t>
       </w:r>
       <w:r>
         <w:rPr>
           <w:rFonts w:ascii="Arial" w:hAnsi="Arial" w:eastAsia="Arial" w:cs="Arial"/>
+        </w:rPr>
+      </w:r>
+      <w:r>
+        <w:rPr>
+          <w:rFonts w:ascii="Arial" w:hAnsi="Arial" w:cs="Arial"/>
         </w:rPr>
       </w:r>
     </w:p>
@@ -2330,11 +2424,16 @@
           <w:sz w:val="24"/>
           <w:szCs w:val="24"/>
         </w:rPr>
-        <w:t xml:space="preserve"> │        ├── Films (films.html)</w:t>
+        <w:t xml:space="preserve">├── Profile / Account</w:t>
       </w:r>
       <w:r>
         <w:rPr>
           <w:rFonts w:ascii="Arial" w:hAnsi="Arial" w:eastAsia="Arial" w:cs="Arial"/>
+        </w:rPr>
+      </w:r>
+      <w:r>
+        <w:rPr>
+          <w:rFonts w:ascii="Arial" w:hAnsi="Arial" w:cs="Arial"/>
         </w:rPr>
       </w:r>
     </w:p>
@@ -2353,11 +2452,16 @@
           <w:sz w:val="24"/>
           <w:szCs w:val="24"/>
         </w:rPr>
-        <w:t xml:space="preserve"> │        ├── Genres Overview (browse.html)</w:t>
+        <w:t xml:space="preserve">│       ├── Login (login.html)</w:t>
       </w:r>
       <w:r>
         <w:rPr>
           <w:rFonts w:ascii="Arial" w:hAnsi="Arial" w:eastAsia="Arial" w:cs="Arial"/>
+        </w:rPr>
+      </w:r>
+      <w:r>
+        <w:rPr>
+          <w:rFonts w:ascii="Arial" w:hAnsi="Arial" w:cs="Arial"/>
         </w:rPr>
       </w:r>
     </w:p>
@@ -2376,149 +2480,16 @@
           <w:sz w:val="24"/>
           <w:szCs w:val="24"/>
         </w:rPr>
-        <w:t xml:space="preserve"> │       └── Genre Results (browse.html?genre=...)</w:t>
-      </w:r>
-      <w:r>
-        <w:rPr>
-          <w:rFonts w:ascii="Arial" w:hAnsi="Arial" w:eastAsia="Arial" w:cs="Arial"/>
-        </w:rPr>
-      </w:r>
-    </w:p>
-    <w:p>
-      <w:pPr>
-        <w:pBdr/>
-        <w:spacing/>
-        <w:ind/>
-        <w:rPr>
-          <w:rFonts w:ascii="Arial" w:hAnsi="Arial" w:cs="Arial"/>
-        </w:rPr>
-      </w:pPr>
-      <w:r>
-        <w:rPr>
-          <w:rFonts w:ascii="Arial" w:hAnsi="Arial" w:eastAsia="Arial" w:cs="Arial"/>
-          <w:sz w:val="24"/>
-          <w:szCs w:val="24"/>
-        </w:rPr>
-        <w:t xml:space="preserve"> ├── Anime Detail Page (anime.html?id=...)</w:t>
-      </w:r>
-      <w:r>
-        <w:rPr>
-          <w:rFonts w:ascii="Arial" w:hAnsi="Arial" w:eastAsia="Arial" w:cs="Arial"/>
-        </w:rPr>
-      </w:r>
-    </w:p>
-    <w:p>
-      <w:pPr>
-        <w:pBdr/>
-        <w:spacing/>
-        <w:ind/>
-        <w:rPr>
-          <w:rFonts w:ascii="Arial" w:hAnsi="Arial" w:cs="Arial"/>
-        </w:rPr>
-      </w:pPr>
-      <w:r>
-        <w:rPr>
-          <w:rFonts w:ascii="Arial" w:hAnsi="Arial" w:eastAsia="Arial" w:cs="Arial"/>
-          <w:sz w:val="24"/>
-          <w:szCs w:val="24"/>
-        </w:rPr>
-        <w:t xml:space="preserve"> ├── Player Page (watch.html?id=...)</w:t>
-      </w:r>
-      <w:r>
-        <w:rPr>
-          <w:rFonts w:ascii="Arial" w:hAnsi="Arial" w:eastAsia="Arial" w:cs="Arial"/>
-        </w:rPr>
-      </w:r>
-    </w:p>
-    <w:p>
-      <w:pPr>
-        <w:pBdr/>
-        <w:spacing/>
-        <w:ind/>
-        <w:rPr>
-          <w:rFonts w:ascii="Arial" w:hAnsi="Arial" w:cs="Arial"/>
-        </w:rPr>
-      </w:pPr>
-      <w:r>
-        <w:rPr>
-          <w:rFonts w:ascii="Arial" w:hAnsi="Arial" w:eastAsia="Arial" w:cs="Arial"/>
-          <w:sz w:val="24"/>
-          <w:szCs w:val="24"/>
-        </w:rPr>
-        <w:t xml:space="preserve">├── Search Results (search.html?q=...)</w:t>
-      </w:r>
-      <w:r>
-        <w:rPr>
-          <w:rFonts w:ascii="Arial" w:hAnsi="Arial" w:eastAsia="Arial" w:cs="Arial"/>
-        </w:rPr>
-      </w:r>
-    </w:p>
-    <w:p>
-      <w:pPr>
-        <w:pBdr/>
-        <w:spacing/>
-        <w:ind/>
-        <w:rPr>
-          <w:rFonts w:ascii="Arial" w:hAnsi="Arial" w:cs="Arial"/>
-        </w:rPr>
-      </w:pPr>
-      <w:r>
-        <w:rPr>
-          <w:rFonts w:ascii="Arial" w:hAnsi="Arial" w:eastAsia="Arial" w:cs="Arial"/>
-          <w:sz w:val="24"/>
-          <w:szCs w:val="24"/>
-        </w:rPr>
-        <w:t xml:space="preserve">├── Profile / Account</w:t>
-      </w:r>
-      <w:r>
-        <w:rPr>
-          <w:rFonts w:ascii="Arial" w:hAnsi="Arial" w:eastAsia="Arial" w:cs="Arial"/>
-        </w:rPr>
-      </w:r>
-    </w:p>
-    <w:p>
-      <w:pPr>
-        <w:pBdr/>
-        <w:spacing/>
-        <w:ind/>
-        <w:rPr>
-          <w:rFonts w:ascii="Arial" w:hAnsi="Arial" w:cs="Arial"/>
-        </w:rPr>
-      </w:pPr>
-      <w:r>
-        <w:rPr>
-          <w:rFonts w:ascii="Arial" w:hAnsi="Arial" w:eastAsia="Arial" w:cs="Arial"/>
-          <w:sz w:val="24"/>
-          <w:szCs w:val="24"/>
-        </w:rPr>
-        <w:t xml:space="preserve">│       ├── Login (login.html)</w:t>
-      </w:r>
-      <w:r>
-        <w:rPr>
-          <w:rFonts w:ascii="Arial" w:hAnsi="Arial" w:eastAsia="Arial" w:cs="Arial"/>
-        </w:rPr>
-      </w:r>
-    </w:p>
-    <w:p>
-      <w:pPr>
-        <w:pBdr/>
-        <w:spacing/>
-        <w:ind/>
-        <w:rPr>
-          <w:rFonts w:ascii="Arial" w:hAnsi="Arial" w:cs="Arial"/>
-        </w:rPr>
-      </w:pPr>
-      <w:r>
-        <w:rPr>
-          <w:rFonts w:ascii="Arial" w:hAnsi="Arial" w:eastAsia="Arial" w:cs="Arial"/>
-          <w:sz w:val="24"/>
-          <w:szCs w:val="24"/>
-        </w:rPr>
         <w:t xml:space="preserve">│       └── Create Account (accountCreate.html)</w:t>
       </w:r>
       <w:r>
         <w:rPr>
           <w:rFonts w:ascii="Arial" w:hAnsi="Arial" w:eastAsia="Arial" w:cs="Arial"/>
+        </w:rPr>
+      </w:r>
+      <w:r>
+        <w:rPr>
+          <w:rFonts w:ascii="Arial" w:hAnsi="Arial" w:cs="Arial"/>
         </w:rPr>
       </w:r>
     </w:p>
@@ -2551,23 +2522,58 @@
       </w:r>
       <w:r>
         <w:rPr>
+          <w:rFonts w:ascii="Arial" w:hAnsi="Arial" w:cs="Arial"/>
+          <w:sz w:val="24"/>
+          <w:szCs w:val="24"/>
+          <w:highlight w:val="none"/>
+        </w:rPr>
+      </w:r>
+    </w:p>
+    <w:p>
+      <w:pPr>
+        <w:pStyle w:val="1009"/>
+        <w:pBdr/>
+        <w:spacing/>
+        <w:ind/>
+        <w:rPr>
+          <w:rFonts w:ascii="Arial" w:hAnsi="Arial" w:cs="Arial"/>
+          <w:sz w:val="24"/>
+          <w:szCs w:val="24"/>
+        </w:rPr>
+      </w:pPr>
+      <w:r>
+        <w:rPr>
           <w:rFonts w:ascii="Arial" w:hAnsi="Arial" w:eastAsia="Arial" w:cs="Arial"/>
           <w:sz w:val="24"/>
           <w:szCs w:val="24"/>
         </w:rPr>
       </w:r>
-    </w:p>
-    <w:p>
-      <w:pPr>
-        <w:pStyle w:val="915"/>
-        <w:pBdr/>
-        <w:spacing/>
-        <w:ind/>
+      <w:r>
+        <w:rPr>
+          <w:rFonts w:ascii="Arial" w:hAnsi="Arial" w:eastAsia="Arial" w:cs="Arial"/>
+          <w:sz w:val="24"/>
+          <w:szCs w:val="24"/>
+        </w:rPr>
+      </w:r>
+      <w:r>
         <w:rPr>
           <w:rFonts w:ascii="Arial" w:hAnsi="Arial" w:cs="Arial"/>
           <w:sz w:val="24"/>
           <w:szCs w:val="24"/>
         </w:rPr>
+      </w:r>
+    </w:p>
+    <w:p>
+      <w:pPr>
+        <w:pStyle w:val="1009"/>
+        <w:pBdr/>
+        <w:spacing/>
+        <w:ind/>
+        <w:rPr>
+          <w:rFonts w:ascii="Arial" w:hAnsi="Arial" w:cs="Arial"/>
+          <w:sz w:val="24"/>
+          <w:szCs w:val="24"/>
+        </w:rPr>
       </w:pPr>
       <w:r>
         <w:rPr>
@@ -2585,7 +2591,7 @@
       </w:r>
       <w:r>
         <w:rPr>
-          <w:rFonts w:ascii="Arial" w:hAnsi="Arial" w:eastAsia="Arial" w:cs="Arial"/>
+          <w:rFonts w:ascii="Arial" w:hAnsi="Arial" w:cs="Arial"/>
           <w:sz w:val="24"/>
           <w:szCs w:val="24"/>
         </w:rPr>
@@ -2593,41 +2599,7 @@
     </w:p>
     <w:p>
       <w:pPr>
-        <w:pStyle w:val="915"/>
-        <w:pBdr/>
-        <w:spacing/>
-        <w:ind/>
-        <w:rPr>
-          <w:rFonts w:ascii="Arial" w:hAnsi="Arial" w:cs="Arial"/>
-          <w:sz w:val="24"/>
-          <w:szCs w:val="24"/>
-        </w:rPr>
-      </w:pPr>
-      <w:r>
-        <w:rPr>
-          <w:rFonts w:ascii="Arial" w:hAnsi="Arial" w:eastAsia="Arial" w:cs="Arial"/>
-          <w:sz w:val="24"/>
-          <w:szCs w:val="24"/>
-        </w:rPr>
-      </w:r>
-      <w:r>
-        <w:rPr>
-          <w:rFonts w:ascii="Arial" w:hAnsi="Arial" w:eastAsia="Arial" w:cs="Arial"/>
-          <w:sz w:val="24"/>
-          <w:szCs w:val="24"/>
-        </w:rPr>
-      </w:r>
-      <w:r>
-        <w:rPr>
-          <w:rFonts w:ascii="Arial" w:hAnsi="Arial" w:eastAsia="Arial" w:cs="Arial"/>
-          <w:sz w:val="24"/>
-          <w:szCs w:val="24"/>
-        </w:rPr>
-      </w:r>
-    </w:p>
-    <w:p>
-      <w:pPr>
-        <w:pStyle w:val="855"/>
+        <w:pStyle w:val="949"/>
         <w:pBdr>
           <w:top w:val="none" w:color="000000" w:sz="4" w:space="0"/>
           <w:left w:val="none" w:color="000000" w:sz="4" w:space="0"/>
@@ -2671,17 +2643,15 @@
       </w:r>
       <w:r>
         <w:rPr>
-          <w:rFonts w:ascii="Arial" w:hAnsi="Arial" w:eastAsia="Arial" w:cs="Arial"/>
-          <w:b/>
-          <w:color w:val="000000"/>
+          <w:rFonts w:ascii="Arial" w:hAnsi="Arial" w:cs="Arial"/>
           <w:sz w:val="28"/>
-          <w:highlight w:val="none"/>
+          <w:szCs w:val="28"/>
         </w:rPr>
       </w:r>
     </w:p>
     <w:p>
       <w:pPr>
-        <w:pStyle w:val="855"/>
+        <w:pStyle w:val="949"/>
         <w:pBdr>
           <w:top w:val="none" w:color="000000" w:sz="4" w:space="0"/>
           <w:left w:val="none" w:color="000000" w:sz="4" w:space="0"/>
@@ -2720,26 +2690,6 @@
       </w:r>
       <w:r>
         <w:rPr>
-          <w:rFonts w:ascii="Arial" w:hAnsi="Arial" w:eastAsia="Arial" w:cs="Arial"/>
-          <w:b/>
-          <w:color w:val="000000"/>
-          <w:sz w:val="28"/>
-          <w:highlight w:val="none"/>
-        </w:rPr>
-      </w:r>
-    </w:p>
-    <w:p>
-      <w:pPr>
-        <w:pStyle w:val="855"/>
-        <w:pBdr>
-          <w:top w:val="none" w:color="000000" w:sz="4" w:space="0"/>
-          <w:left w:val="none" w:color="000000" w:sz="4" w:space="0"/>
-          <w:bottom w:val="none" w:color="000000" w:sz="4" w:space="0"/>
-          <w:right w:val="none" w:color="000000" w:sz="4" w:space="0"/>
-        </w:pBdr>
-        <w:spacing/>
-        <w:ind w:right="0" w:firstLine="0" w:left="0"/>
-        <w:rPr>
           <w:rFonts w:ascii="Arial" w:hAnsi="Arial" w:cs="Arial"/>
           <w:b/>
           <w:bCs/>
@@ -2748,24 +2698,11 @@
           <w:szCs w:val="28"/>
           <w:highlight w:val="none"/>
         </w:rPr>
-      </w:pPr>
-      <w:r>
-        <w:rPr>
-          <w:rFonts w:ascii="Arial" w:hAnsi="Arial" w:eastAsia="Arial" w:cs="Arial"/>
-          <w:b/>
-          <w:color w:val="000000"/>
-          <w:sz w:val="28"/>
-        </w:rPr>
-        <w:t xml:space="preserve">1. Browsing via Genres</w:t>
-      </w:r>
-      <w:r>
-        <w:rPr>
-          <w:rFonts w:ascii="Arial" w:hAnsi="Arial" w:eastAsia="Arial" w:cs="Arial"/>
-        </w:rPr>
       </w:r>
     </w:p>
     <w:p>
       <w:pPr>
+        <w:pStyle w:val="949"/>
         <w:pBdr>
           <w:top w:val="none" w:color="000000" w:sz="4" w:space="0"/>
           <w:left w:val="none" w:color="000000" w:sz="4" w:space="0"/>
@@ -2776,25 +2713,42 @@
         <w:ind w:right="0" w:firstLine="0" w:left="0"/>
         <w:rPr>
           <w:rFonts w:ascii="Arial" w:hAnsi="Arial" w:cs="Arial"/>
+          <w:b/>
+          <w:bCs/>
+          <w:color w:val="000000"/>
+          <w:sz w:val="28"/>
+          <w:szCs w:val="28"/>
+          <w:highlight w:val="none"/>
         </w:rPr>
       </w:pPr>
       <w:r>
         <w:rPr>
           <w:rFonts w:ascii="Arial" w:hAnsi="Arial" w:eastAsia="Arial" w:cs="Arial"/>
+          <w:b/>
           <w:color w:val="000000"/>
-          <w:sz w:val="24"/>
-        </w:rPr>
-        <w:t xml:space="preserve">Home → Browse → Genres → Browse Page (Genres Overview) → Select “See More” on a Genre → Browse Page (Filtered by Genre) → Anime Detail Page → Watch Page</w:t>
+          <w:sz w:val="28"/>
+        </w:rPr>
+        <w:t xml:space="preserve">1. Browsing via Genres</w:t>
       </w:r>
       <w:r>
         <w:rPr>
           <w:rFonts w:ascii="Arial" w:hAnsi="Arial" w:eastAsia="Arial" w:cs="Arial"/>
+        </w:rPr>
+      </w:r>
+      <w:r>
+        <w:rPr>
+          <w:rFonts w:ascii="Arial" w:hAnsi="Arial" w:cs="Arial"/>
+          <w:b/>
+          <w:bCs/>
+          <w:color w:val="000000"/>
+          <w:sz w:val="28"/>
+          <w:szCs w:val="28"/>
+          <w:highlight w:val="none"/>
         </w:rPr>
       </w:r>
     </w:p>
     <w:p>
       <w:pPr>
-        <w:pStyle w:val="855"/>
         <w:pBdr>
           <w:top w:val="none" w:color="000000" w:sz="4" w:space="0"/>
           <w:left w:val="none" w:color="000000" w:sz="4" w:space="0"/>
@@ -2810,20 +2764,25 @@
       <w:r>
         <w:rPr>
           <w:rFonts w:ascii="Arial" w:hAnsi="Arial" w:eastAsia="Arial" w:cs="Arial"/>
-          <w:b/>
           <w:color w:val="000000"/>
-          <w:sz w:val="28"/>
-        </w:rPr>
-        <w:t xml:space="preserve">2. Browsing Series</w:t>
+          <w:sz w:val="24"/>
+        </w:rPr>
+        <w:t xml:space="preserve">Home → Browse → Genres → Browse Page (Genres Overview) → Select “See More” on a Genre → Browse Page (Filtered by Genre) → Anime Detail Page → Watch Page</w:t>
       </w:r>
       <w:r>
         <w:rPr>
           <w:rFonts w:ascii="Arial" w:hAnsi="Arial" w:eastAsia="Arial" w:cs="Arial"/>
+        </w:rPr>
+      </w:r>
+      <w:r>
+        <w:rPr>
+          <w:rFonts w:ascii="Arial" w:hAnsi="Arial" w:cs="Arial"/>
         </w:rPr>
       </w:r>
     </w:p>
     <w:p>
       <w:pPr>
+        <w:pStyle w:val="949"/>
         <w:pBdr>
           <w:top w:val="none" w:color="000000" w:sz="4" w:space="0"/>
           <w:left w:val="none" w:color="000000" w:sz="4" w:space="0"/>
@@ -2839,20 +2798,25 @@
       <w:r>
         <w:rPr>
           <w:rFonts w:ascii="Arial" w:hAnsi="Arial" w:eastAsia="Arial" w:cs="Arial"/>
+          <w:b/>
           <w:color w:val="000000"/>
-          <w:sz w:val="24"/>
-        </w:rPr>
-        <w:t xml:space="preserve">Home → Browse → Series → Series Page → Select Anime → Anime Detail Page → Watch Page</w:t>
+          <w:sz w:val="28"/>
+        </w:rPr>
+        <w:t xml:space="preserve">2. Browsing Series</w:t>
       </w:r>
       <w:r>
         <w:rPr>
           <w:rFonts w:ascii="Arial" w:hAnsi="Arial" w:eastAsia="Arial" w:cs="Arial"/>
+        </w:rPr>
+      </w:r>
+      <w:r>
+        <w:rPr>
+          <w:rFonts w:ascii="Arial" w:hAnsi="Arial" w:cs="Arial"/>
         </w:rPr>
       </w:r>
     </w:p>
     <w:p>
       <w:pPr>
-        <w:pStyle w:val="855"/>
         <w:pBdr>
           <w:top w:val="none" w:color="000000" w:sz="4" w:space="0"/>
           <w:left w:val="none" w:color="000000" w:sz="4" w:space="0"/>
@@ -2868,20 +2832,25 @@
       <w:r>
         <w:rPr>
           <w:rFonts w:ascii="Arial" w:hAnsi="Arial" w:eastAsia="Arial" w:cs="Arial"/>
-          <w:b/>
           <w:color w:val="000000"/>
-          <w:sz w:val="28"/>
-        </w:rPr>
-        <w:t xml:space="preserve">3. Browsing Films</w:t>
+          <w:sz w:val="24"/>
+        </w:rPr>
+        <w:t xml:space="preserve">Home → Browse → Series → Series Page → Select Anime → Anime Detail Page → Watch Page</w:t>
       </w:r>
       <w:r>
         <w:rPr>
           <w:rFonts w:ascii="Arial" w:hAnsi="Arial" w:eastAsia="Arial" w:cs="Arial"/>
+        </w:rPr>
+      </w:r>
+      <w:r>
+        <w:rPr>
+          <w:rFonts w:ascii="Arial" w:hAnsi="Arial" w:cs="Arial"/>
         </w:rPr>
       </w:r>
     </w:p>
     <w:p>
       <w:pPr>
+        <w:pStyle w:val="949"/>
         <w:pBdr>
           <w:top w:val="none" w:color="000000" w:sz="4" w:space="0"/>
           <w:left w:val="none" w:color="000000" w:sz="4" w:space="0"/>
@@ -2897,20 +2866,25 @@
       <w:r>
         <w:rPr>
           <w:rFonts w:ascii="Arial" w:hAnsi="Arial" w:eastAsia="Arial" w:cs="Arial"/>
+          <w:b/>
           <w:color w:val="000000"/>
-          <w:sz w:val="24"/>
-        </w:rPr>
-        <w:t xml:space="preserve">Home → Browse → Films → Films Page → Select Film → Anime Detail Page → Watch Page</w:t>
+          <w:sz w:val="28"/>
+        </w:rPr>
+        <w:t xml:space="preserve">3. Browsing Films</w:t>
       </w:r>
       <w:r>
         <w:rPr>
           <w:rFonts w:ascii="Arial" w:hAnsi="Arial" w:eastAsia="Arial" w:cs="Arial"/>
+        </w:rPr>
+      </w:r>
+      <w:r>
+        <w:rPr>
+          <w:rFonts w:ascii="Arial" w:hAnsi="Arial" w:cs="Arial"/>
         </w:rPr>
       </w:r>
     </w:p>
     <w:p>
       <w:pPr>
-        <w:pStyle w:val="855"/>
         <w:pBdr>
           <w:top w:val="none" w:color="000000" w:sz="4" w:space="0"/>
           <w:left w:val="none" w:color="000000" w:sz="4" w:space="0"/>
@@ -2926,20 +2900,25 @@
       <w:r>
         <w:rPr>
           <w:rFonts w:ascii="Arial" w:hAnsi="Arial" w:eastAsia="Arial" w:cs="Arial"/>
-          <w:b/>
           <w:color w:val="000000"/>
-          <w:sz w:val="28"/>
-        </w:rPr>
-        <w:t xml:space="preserve"> 4. Using Search</w:t>
+          <w:sz w:val="24"/>
+        </w:rPr>
+        <w:t xml:space="preserve">Home → Browse → Films → Films Page → Select Film → Anime Detail Page → Watch Page</w:t>
       </w:r>
       <w:r>
         <w:rPr>
           <w:rFonts w:ascii="Arial" w:hAnsi="Arial" w:eastAsia="Arial" w:cs="Arial"/>
+        </w:rPr>
+      </w:r>
+      <w:r>
+        <w:rPr>
+          <w:rFonts w:ascii="Arial" w:hAnsi="Arial" w:cs="Arial"/>
         </w:rPr>
       </w:r>
     </w:p>
     <w:p>
       <w:pPr>
+        <w:pStyle w:val="949"/>
         <w:pBdr>
           <w:top w:val="none" w:color="000000" w:sz="4" w:space="0"/>
           <w:left w:val="none" w:color="000000" w:sz="4" w:space="0"/>
@@ -2955,20 +2934,25 @@
       <w:r>
         <w:rPr>
           <w:rFonts w:ascii="Arial" w:hAnsi="Arial" w:eastAsia="Arial" w:cs="Arial"/>
+          <w:b/>
           <w:color w:val="000000"/>
-          <w:sz w:val="24"/>
-        </w:rPr>
-        <w:t xml:space="preserve">Home → Search Icon → Search Results Page → Select Anime → Anime Detail Page → Watch Page</w:t>
+          <w:sz w:val="28"/>
+        </w:rPr>
+        <w:t xml:space="preserve"> 4. Using Search</w:t>
       </w:r>
       <w:r>
         <w:rPr>
           <w:rFonts w:ascii="Arial" w:hAnsi="Arial" w:eastAsia="Arial" w:cs="Arial"/>
+        </w:rPr>
+      </w:r>
+      <w:r>
+        <w:rPr>
+          <w:rFonts w:ascii="Arial" w:hAnsi="Arial" w:cs="Arial"/>
         </w:rPr>
       </w:r>
     </w:p>
     <w:p>
       <w:pPr>
-        <w:pStyle w:val="855"/>
         <w:pBdr>
           <w:top w:val="none" w:color="000000" w:sz="4" w:space="0"/>
           <w:left w:val="none" w:color="000000" w:sz="4" w:space="0"/>
@@ -2984,20 +2968,25 @@
       <w:r>
         <w:rPr>
           <w:rFonts w:ascii="Arial" w:hAnsi="Arial" w:eastAsia="Arial" w:cs="Arial"/>
-          <w:b/>
           <w:color w:val="000000"/>
-          <w:sz w:val="28"/>
-        </w:rPr>
-        <w:t xml:space="preserve">5. Login</w:t>
+          <w:sz w:val="24"/>
+        </w:rPr>
+        <w:t xml:space="preserve">Home → Search Icon → Search Results Page → Select Anime → Anime Detail Page → Watch Page</w:t>
       </w:r>
       <w:r>
         <w:rPr>
           <w:rFonts w:ascii="Arial" w:hAnsi="Arial" w:eastAsia="Arial" w:cs="Arial"/>
+        </w:rPr>
+      </w:r>
+      <w:r>
+        <w:rPr>
+          <w:rFonts w:ascii="Arial" w:hAnsi="Arial" w:cs="Arial"/>
         </w:rPr>
       </w:r>
     </w:p>
     <w:p>
       <w:pPr>
+        <w:pStyle w:val="949"/>
         <w:pBdr>
           <w:top w:val="none" w:color="000000" w:sz="4" w:space="0"/>
           <w:left w:val="none" w:color="000000" w:sz="4" w:space="0"/>
@@ -3013,20 +3002,25 @@
       <w:r>
         <w:rPr>
           <w:rFonts w:ascii="Arial" w:hAnsi="Arial" w:eastAsia="Arial" w:cs="Arial"/>
+          <w:b/>
           <w:color w:val="000000"/>
-          <w:sz w:val="24"/>
-        </w:rPr>
-        <w:t xml:space="preserve">Home → Profile Icon → Login → Login Page</w:t>
+          <w:sz w:val="28"/>
+        </w:rPr>
+        <w:t xml:space="preserve">5. Login</w:t>
       </w:r>
       <w:r>
         <w:rPr>
           <w:rFonts w:ascii="Arial" w:hAnsi="Arial" w:eastAsia="Arial" w:cs="Arial"/>
+        </w:rPr>
+      </w:r>
+      <w:r>
+        <w:rPr>
+          <w:rFonts w:ascii="Arial" w:hAnsi="Arial" w:cs="Arial"/>
         </w:rPr>
       </w:r>
     </w:p>
     <w:p>
       <w:pPr>
-        <w:pStyle w:val="855"/>
         <w:pBdr>
           <w:top w:val="none" w:color="000000" w:sz="4" w:space="0"/>
           <w:left w:val="none" w:color="000000" w:sz="4" w:space="0"/>
@@ -3042,20 +3036,25 @@
       <w:r>
         <w:rPr>
           <w:rFonts w:ascii="Arial" w:hAnsi="Arial" w:eastAsia="Arial" w:cs="Arial"/>
-          <w:b/>
           <w:color w:val="000000"/>
-          <w:sz w:val="28"/>
-        </w:rPr>
-        <w:t xml:space="preserve">6. Creating an Account</w:t>
+          <w:sz w:val="24"/>
+        </w:rPr>
+        <w:t xml:space="preserve">Home → Profile Icon → Login → Login Page</w:t>
       </w:r>
       <w:r>
         <w:rPr>
           <w:rFonts w:ascii="Arial" w:hAnsi="Arial" w:eastAsia="Arial" w:cs="Arial"/>
+        </w:rPr>
+      </w:r>
+      <w:r>
+        <w:rPr>
+          <w:rFonts w:ascii="Arial" w:hAnsi="Arial" w:cs="Arial"/>
         </w:rPr>
       </w:r>
     </w:p>
     <w:p>
       <w:pPr>
+        <w:pStyle w:val="949"/>
         <w:pBdr>
           <w:top w:val="none" w:color="000000" w:sz="4" w:space="0"/>
           <w:left w:val="none" w:color="000000" w:sz="4" w:space="0"/>
@@ -3071,20 +3070,25 @@
       <w:r>
         <w:rPr>
           <w:rFonts w:ascii="Arial" w:hAnsi="Arial" w:eastAsia="Arial" w:cs="Arial"/>
+          <w:b/>
           <w:color w:val="000000"/>
-          <w:sz w:val="24"/>
-        </w:rPr>
-        <w:t xml:space="preserve">Home → Profile Icon → Create Account → Create Account Page</w:t>
+          <w:sz w:val="28"/>
+        </w:rPr>
+        <w:t xml:space="preserve">6. Creating an Account</w:t>
       </w:r>
       <w:r>
         <w:rPr>
           <w:rFonts w:ascii="Arial" w:hAnsi="Arial" w:eastAsia="Arial" w:cs="Arial"/>
+        </w:rPr>
+      </w:r>
+      <w:r>
+        <w:rPr>
+          <w:rFonts w:ascii="Arial" w:hAnsi="Arial" w:cs="Arial"/>
         </w:rPr>
       </w:r>
     </w:p>
     <w:p>
       <w:pPr>
-        <w:pStyle w:val="855"/>
         <w:pBdr>
           <w:top w:val="none" w:color="000000" w:sz="4" w:space="0"/>
           <w:left w:val="none" w:color="000000" w:sz="4" w:space="0"/>
@@ -3100,20 +3104,25 @@
       <w:r>
         <w:rPr>
           <w:rFonts w:ascii="Arial" w:hAnsi="Arial" w:eastAsia="Arial" w:cs="Arial"/>
-          <w:b/>
           <w:color w:val="000000"/>
-          <w:sz w:val="28"/>
-        </w:rPr>
-        <w:t xml:space="preserve">7. Contact Page Access</w:t>
+          <w:sz w:val="24"/>
+        </w:rPr>
+        <w:t xml:space="preserve">Home → Profile Icon → Create Account → Create Account Page</w:t>
       </w:r>
       <w:r>
         <w:rPr>
           <w:rFonts w:ascii="Arial" w:hAnsi="Arial" w:eastAsia="Arial" w:cs="Arial"/>
+        </w:rPr>
+      </w:r>
+      <w:r>
+        <w:rPr>
+          <w:rFonts w:ascii="Arial" w:hAnsi="Arial" w:cs="Arial"/>
         </w:rPr>
       </w:r>
     </w:p>
     <w:p>
       <w:pPr>
+        <w:pStyle w:val="949"/>
         <w:pBdr>
           <w:top w:val="none" w:color="000000" w:sz="4" w:space="0"/>
           <w:left w:val="none" w:color="000000" w:sz="4" w:space="0"/>
@@ -3129,14 +3138,20 @@
       <w:r>
         <w:rPr>
           <w:rFonts w:ascii="Arial" w:hAnsi="Arial" w:eastAsia="Arial" w:cs="Arial"/>
+          <w:b/>
           <w:color w:val="000000"/>
-          <w:sz w:val="24"/>
-        </w:rPr>
-        <w:t xml:space="preserve">Home → Footer → Contact Us → Contact Page</w:t>
+          <w:sz w:val="28"/>
+        </w:rPr>
+        <w:t xml:space="preserve">7. Contact Page Access</w:t>
       </w:r>
       <w:r>
         <w:rPr>
           <w:rFonts w:ascii="Arial" w:hAnsi="Arial" w:eastAsia="Arial" w:cs="Arial"/>
+        </w:rPr>
+      </w:r>
+      <w:r>
+        <w:rPr>
+          <w:rFonts w:ascii="Arial" w:hAnsi="Arial" w:cs="Arial"/>
         </w:rPr>
       </w:r>
     </w:p>
@@ -3149,32 +3164,27 @@
           <w:right w:val="none" w:color="000000" w:sz="4" w:space="0"/>
         </w:pBdr>
         <w:spacing/>
-        <w:ind w:right="0"/>
+        <w:ind w:right="0" w:firstLine="0" w:left="0"/>
         <w:rPr>
           <w:rFonts w:ascii="Arial" w:hAnsi="Arial" w:cs="Arial"/>
+        </w:rPr>
+      </w:pPr>
+      <w:r>
+        <w:rPr>
+          <w:rFonts w:ascii="Arial" w:hAnsi="Arial" w:eastAsia="Arial" w:cs="Arial"/>
+          <w:color w:val="000000"/>
           <w:sz w:val="24"/>
-          <w:szCs w:val="24"/>
-        </w:rPr>
-      </w:pPr>
-      <w:r>
-        <w:rPr>
-          <w:rFonts w:ascii="Arial" w:hAnsi="Arial" w:cs="Arial"/>
-          <w:sz w:val="24"/>
-          <w:szCs w:val="24"/>
-        </w:rPr>
+        </w:rPr>
+        <w:t xml:space="preserve">Home → Footer → Contact Us → Contact Page</w:t>
       </w:r>
       <w:r>
         <w:rPr>
-          <w:rFonts w:ascii="Arial" w:hAnsi="Arial" w:cs="Arial"/>
-          <w:sz w:val="24"/>
-          <w:szCs w:val="24"/>
+          <w:rFonts w:ascii="Arial" w:hAnsi="Arial" w:eastAsia="Arial" w:cs="Arial"/>
         </w:rPr>
       </w:r>
       <w:r>
         <w:rPr>
           <w:rFonts w:ascii="Arial" w:hAnsi="Arial" w:cs="Arial"/>
-          <w:sz w:val="24"/>
-          <w:szCs w:val="24"/>
         </w:rPr>
       </w:r>
     </w:p>
@@ -3348,14 +3358,21 @@
       </w:pPr>
       <w:r>
         <w:rPr>
-          <w:rFonts w:ascii="Arial" w:hAnsi="Arial" w:eastAsia="Arial" w:cs="Arial"/>
+          <w:rFonts w:ascii="Arial" w:hAnsi="Arial" w:cs="Arial"/>
           <w:sz w:val="24"/>
           <w:szCs w:val="24"/>
         </w:rPr>
       </w:r>
       <w:r>
         <w:rPr>
-          <w:rFonts w:ascii="Arial" w:hAnsi="Arial" w:eastAsia="Arial" w:cs="Arial"/>
+          <w:rFonts w:ascii="Arial" w:hAnsi="Arial" w:cs="Arial"/>
+          <w:sz w:val="24"/>
+          <w:szCs w:val="24"/>
+        </w:rPr>
+      </w:r>
+      <w:r>
+        <w:rPr>
+          <w:rFonts w:ascii="Arial" w:hAnsi="Arial" w:cs="Arial"/>
           <w:sz w:val="24"/>
           <w:szCs w:val="24"/>
         </w:rPr>
@@ -3375,6 +3392,44 @@
           <w:rFonts w:ascii="Arial" w:hAnsi="Arial" w:cs="Arial"/>
           <w:sz w:val="24"/>
           <w:szCs w:val="24"/>
+        </w:rPr>
+      </w:pPr>
+      <w:r>
+        <w:rPr>
+          <w:rFonts w:ascii="Arial" w:hAnsi="Arial" w:eastAsia="Arial" w:cs="Arial"/>
+          <w:sz w:val="24"/>
+          <w:szCs w:val="24"/>
+        </w:rPr>
+      </w:r>
+      <w:r>
+        <w:rPr>
+          <w:rFonts w:ascii="Arial" w:hAnsi="Arial" w:eastAsia="Arial" w:cs="Arial"/>
+          <w:sz w:val="24"/>
+          <w:szCs w:val="24"/>
+        </w:rPr>
+      </w:r>
+      <w:r>
+        <w:rPr>
+          <w:rFonts w:ascii="Arial" w:hAnsi="Arial" w:cs="Arial"/>
+          <w:sz w:val="24"/>
+          <w:szCs w:val="24"/>
+        </w:rPr>
+      </w:r>
+    </w:p>
+    <w:p>
+      <w:pPr>
+        <w:pBdr>
+          <w:top w:val="none" w:color="000000" w:sz="4" w:space="0"/>
+          <w:left w:val="none" w:color="000000" w:sz="4" w:space="0"/>
+          <w:bottom w:val="none" w:color="000000" w:sz="4" w:space="0"/>
+          <w:right w:val="none" w:color="000000" w:sz="4" w:space="0"/>
+        </w:pBdr>
+        <w:spacing/>
+        <w:ind w:right="0"/>
+        <w:rPr>
+          <w:rFonts w:ascii="Arial" w:hAnsi="Arial" w:cs="Arial"/>
+          <w:sz w:val="24"/>
+          <w:szCs w:val="24"/>
           <w:highlight w:val="none"/>
         </w:rPr>
       </w:pPr>
@@ -3430,20 +3485,7 @@
           <w:rFonts w:ascii="Arial" w:hAnsi="Arial" w:cs="Arial"/>
           <w:sz w:val="24"/>
           <w:szCs w:val="24"/>
-        </w:rPr>
-      </w:r>
-      <w:r>
-        <w:rPr>
-          <w:rFonts w:ascii="Arial" w:hAnsi="Arial" w:cs="Arial"/>
-          <w:sz w:val="24"/>
-          <w:szCs w:val="24"/>
-        </w:rPr>
-      </w:r>
-      <w:r>
-        <w:rPr>
-          <w:rFonts w:ascii="Arial" w:hAnsi="Arial" w:cs="Arial"/>
-          <w:sz w:val="24"/>
-          <w:szCs w:val="24"/>
+          <w:highlight w:val="none"/>
         </w:rPr>
       </w:r>
     </w:p>
@@ -3562,15 +3604,6 @@
           <w:rFonts w:ascii="Arial" w:hAnsi="Arial" w:cs="Arial"/>
           <w:sz w:val="24"/>
           <w:szCs w:val="24"/>
-          <w:highlight w:val="none"/>
-        </w:rPr>
-      </w:r>
-      <w:r>
-        <w:rPr>
-          <w:rFonts w:ascii="Arial" w:hAnsi="Arial" w:cs="Arial"/>
-          <w:sz w:val="24"/>
-          <w:szCs w:val="24"/>
-          <w:highlight w:val="none"/>
         </w:rPr>
       </w:r>
     </w:p>
@@ -3611,7 +3644,6 @@
           <w:rFonts w:ascii="Arial" w:hAnsi="Arial" w:cs="Arial"/>
           <w:sz w:val="24"/>
           <w:szCs w:val="24"/>
-          <w:highlight w:val="none"/>
         </w:rPr>
       </w:r>
     </w:p>
@@ -3647,11 +3679,18 @@
           <w:szCs w:val="24"/>
         </w:rPr>
       </w:r>
-      <w:r/>
+      <w:r>
+        <w:rPr>
+          <w:rFonts w:ascii="Arial" w:hAnsi="Arial" w:cs="Arial"/>
+          <w:sz w:val="24"/>
+          <w:szCs w:val="24"/>
+          <w:highlight w:val="none"/>
+        </w:rPr>
+      </w:r>
     </w:p>
     <w:p>
       <w:pPr>
-        <w:pStyle w:val="853"/>
+        <w:pStyle w:val="947"/>
         <w:pBdr/>
         <w:spacing/>
         <w:ind/>
@@ -3682,10 +3721,19 @@
           <w:szCs w:val="48"/>
         </w:rPr>
       </w:r>
+      <w:r>
+        <w:rPr>
+          <w:rFonts w:ascii="Arial" w:hAnsi="Arial" w:cs="Arial"/>
+          <w:b/>
+          <w:bCs/>
+          <w:sz w:val="48"/>
+          <w:szCs w:val="48"/>
+        </w:rPr>
+      </w:r>
     </w:p>
     <w:p>
       <w:pPr>
-        <w:pStyle w:val="855"/>
+        <w:pStyle w:val="949"/>
         <w:pBdr/>
         <w:spacing/>
         <w:ind/>
@@ -3712,12 +3760,13 @@
         <w:rPr>
           <w:sz w:val="36"/>
           <w:szCs w:val="36"/>
+          <w14:ligatures w14:val="none"/>
         </w:rPr>
       </w:r>
     </w:p>
     <w:p>
       <w:pPr>
-        <w:pStyle w:val="855"/>
+        <w:pStyle w:val="949"/>
         <w:pBdr>
           <w:top w:val="none" w:color="000000" w:sz="4" w:space="0"/>
           <w:left w:val="none" w:color="000000" w:sz="4" w:space="0"/>
@@ -3747,27 +3796,13 @@
       </w:r>
       <w:r>
         <w:rPr>
-          <w:rFonts w:ascii="Arial" w:hAnsi="Arial" w:eastAsia="Arial" w:cs="Arial"/>
-          <w:b/>
-          <w:color w:val="000000"/>
-          <w:sz w:val="28"/>
-        </w:rPr>
-      </w:r>
-      <w:r>
-        <w:rPr>
-          <w:rFonts w:ascii="Arial" w:hAnsi="Arial" w:eastAsia="Arial" w:cs="Arial"/>
-        </w:rPr>
-      </w:r>
-      <w:r/>
-      <w:r>
-        <w:rPr>
           <w:rFonts w:ascii="Arial" w:hAnsi="Arial" w:cs="Arial"/>
         </w:rPr>
       </w:r>
     </w:p>
     <w:p>
       <w:pPr>
-        <w:pStyle w:val="916"/>
+        <w:pStyle w:val="1010"/>
         <w:numPr>
           <w:ilvl w:val="0"/>
           <w:numId w:val="33"/>
@@ -3809,13 +3844,13 @@
       </w:r>
       <w:r>
         <w:rPr>
-          <w:rFonts w:ascii="Arial" w:hAnsi="Arial" w:eastAsia="Arial" w:cs="Arial"/>
+          <w:rFonts w:ascii="Arial" w:hAnsi="Arial" w:cs="Arial"/>
         </w:rPr>
       </w:r>
     </w:p>
     <w:p>
       <w:pPr>
-        <w:pStyle w:val="916"/>
+        <w:pStyle w:val="1010"/>
         <w:numPr>
           <w:ilvl w:val="0"/>
           <w:numId w:val="33"/>
@@ -3857,13 +3892,13 @@
       </w:r>
       <w:r>
         <w:rPr>
-          <w:rFonts w:ascii="Arial" w:hAnsi="Arial" w:eastAsia="Arial" w:cs="Arial"/>
+          <w:rFonts w:ascii="Arial" w:hAnsi="Arial" w:cs="Arial"/>
         </w:rPr>
       </w:r>
     </w:p>
     <w:p>
       <w:pPr>
-        <w:pStyle w:val="916"/>
+        <w:pStyle w:val="1010"/>
         <w:numPr>
           <w:ilvl w:val="0"/>
           <w:numId w:val="33"/>
@@ -3918,10 +3953,15 @@
           <w:rFonts w:ascii="Arial" w:hAnsi="Arial" w:cs="Arial"/>
         </w:rPr>
       </w:r>
+      <w:r>
+        <w:rPr>
+          <w:rFonts w:ascii="Arial" w:hAnsi="Arial" w:cs="Arial"/>
+        </w:rPr>
+      </w:r>
     </w:p>
     <w:p>
       <w:pPr>
-        <w:pStyle w:val="916"/>
+        <w:pStyle w:val="1010"/>
         <w:numPr>
           <w:ilvl w:val="0"/>
           <w:numId w:val="33"/>
@@ -3966,10 +4006,16 @@
           <w:rFonts w:ascii="Arial" w:hAnsi="Arial" w:cs="Arial"/>
         </w:rPr>
       </w:r>
+      <w:r>
+        <w:rPr>
+          <w:rFonts w:ascii="Arial" w:hAnsi="Arial" w:eastAsia="Arial" w:cs="Arial"/>
+          <w:highlight w:val="none"/>
+        </w:rPr>
+      </w:r>
     </w:p>
     <w:p>
       <w:pPr>
-        <w:pStyle w:val="916"/>
+        <w:pStyle w:val="1010"/>
         <w:numPr>
           <w:ilvl w:val="0"/>
           <w:numId w:val="36"/>
@@ -4012,7 +4058,11 @@
           <w:rFonts w:ascii="Arial" w:hAnsi="Arial" w:cs="Arial"/>
         </w:rPr>
       </w:r>
-      <w:r/>
+      <w:r>
+        <w:rPr>
+          <w:rFonts w:ascii="Arial" w:hAnsi="Arial" w:cs="Arial"/>
+        </w:rPr>
+      </w:r>
     </w:p>
     <w:p>
       <w:pPr>
@@ -4042,14 +4092,13 @@
       </w:r>
       <w:r>
         <w:rPr>
-          <w:rFonts w:ascii="Arial" w:hAnsi="Arial" w:eastAsia="Arial" w:cs="Arial"/>
-          <w:highlight w:val="none"/>
+          <w:rFonts w:ascii="Arial" w:hAnsi="Arial" w:cs="Arial"/>
         </w:rPr>
       </w:r>
     </w:p>
     <w:p>
       <w:pPr>
-        <w:pStyle w:val="855"/>
+        <w:pStyle w:val="949"/>
         <w:pBdr>
           <w:top w:val="none" w:color="000000" w:sz="4" w:space="0"/>
           <w:left w:val="none" w:color="000000" w:sz="4" w:space="0"/>
@@ -4078,13 +4127,13 @@
       </w:r>
       <w:r>
         <w:rPr>
-          <w:rFonts w:ascii="Arial" w:hAnsi="Arial" w:eastAsia="Arial" w:cs="Arial"/>
+          <w:rFonts w:ascii="Arial" w:hAnsi="Arial" w:cs="Arial"/>
         </w:rPr>
       </w:r>
     </w:p>
     <w:p>
       <w:pPr>
-        <w:pStyle w:val="916"/>
+        <w:pStyle w:val="1010"/>
         <w:numPr>
           <w:ilvl w:val="0"/>
           <w:numId w:val="37"/>
@@ -4127,13 +4176,13 @@
       </w:r>
       <w:r>
         <w:rPr>
-          <w:rFonts w:ascii="Arial" w:hAnsi="Arial" w:eastAsia="Arial" w:cs="Arial"/>
+          <w:rFonts w:ascii="Arial" w:hAnsi="Arial" w:cs="Arial"/>
         </w:rPr>
       </w:r>
     </w:p>
     <w:p>
       <w:pPr>
-        <w:pStyle w:val="855"/>
+        <w:pStyle w:val="949"/>
         <w:pBdr>
           <w:top w:val="none" w:color="000000" w:sz="4" w:space="0"/>
           <w:left w:val="none" w:color="000000" w:sz="4" w:space="0"/>
@@ -4162,13 +4211,13 @@
       </w:r>
       <w:r>
         <w:rPr>
-          <w:rFonts w:ascii="Arial" w:hAnsi="Arial" w:eastAsia="Arial" w:cs="Arial"/>
+          <w:rFonts w:ascii="Arial" w:hAnsi="Arial" w:cs="Arial"/>
         </w:rPr>
       </w:r>
     </w:p>
     <w:p>
       <w:pPr>
-        <w:pStyle w:val="916"/>
+        <w:pStyle w:val="1010"/>
         <w:numPr>
           <w:ilvl w:val="0"/>
           <w:numId w:val="38"/>
@@ -4202,13 +4251,13 @@
       </w:r>
       <w:r>
         <w:rPr>
-          <w:rFonts w:ascii="Arial" w:hAnsi="Arial" w:eastAsia="Arial" w:cs="Arial"/>
+          <w:rFonts w:ascii="Arial" w:hAnsi="Arial" w:cs="Arial"/>
         </w:rPr>
       </w:r>
     </w:p>
     <w:p>
       <w:pPr>
-        <w:pStyle w:val="916"/>
+        <w:pStyle w:val="1010"/>
         <w:numPr>
           <w:ilvl w:val="1"/>
           <w:numId w:val="39"/>
@@ -4240,13 +4289,13 @@
       </w:r>
       <w:r>
         <w:rPr>
-          <w:rFonts w:ascii="Arial" w:hAnsi="Arial" w:eastAsia="Arial" w:cs="Arial"/>
+          <w:rFonts w:ascii="Arial" w:hAnsi="Arial" w:cs="Arial"/>
         </w:rPr>
       </w:r>
     </w:p>
     <w:p>
       <w:pPr>
-        <w:pStyle w:val="916"/>
+        <w:pStyle w:val="1010"/>
         <w:numPr>
           <w:ilvl w:val="1"/>
           <w:numId w:val="39"/>
@@ -4278,13 +4327,13 @@
       </w:r>
       <w:r>
         <w:rPr>
-          <w:rFonts w:ascii="Arial" w:hAnsi="Arial" w:eastAsia="Arial" w:cs="Arial"/>
+          <w:rFonts w:ascii="Arial" w:hAnsi="Arial" w:cs="Arial"/>
         </w:rPr>
       </w:r>
     </w:p>
     <w:p>
       <w:pPr>
-        <w:pStyle w:val="916"/>
+        <w:pStyle w:val="1010"/>
         <w:numPr>
           <w:ilvl w:val="1"/>
           <w:numId w:val="39"/>
@@ -4316,13 +4365,13 @@
       </w:r>
       <w:r>
         <w:rPr>
-          <w:rFonts w:ascii="Arial" w:hAnsi="Arial" w:eastAsia="Arial" w:cs="Arial"/>
+          <w:rFonts w:ascii="Arial" w:hAnsi="Arial" w:cs="Arial"/>
         </w:rPr>
       </w:r>
     </w:p>
     <w:p>
       <w:pPr>
-        <w:pStyle w:val="916"/>
+        <w:pStyle w:val="1010"/>
         <w:numPr>
           <w:ilvl w:val="1"/>
           <w:numId w:val="39"/>
@@ -4354,7 +4403,7 @@
       </w:r>
       <w:r>
         <w:rPr>
-          <w:rFonts w:ascii="Arial" w:hAnsi="Arial" w:eastAsia="Arial" w:cs="Arial"/>
+          <w:rFonts w:ascii="Arial" w:hAnsi="Arial" w:cs="Arial"/>
         </w:rPr>
       </w:r>
     </w:p>
@@ -4392,16 +4441,15 @@
       </w:r>
       <w:r>
         <w:rPr>
-          <w:rFonts w:ascii="Arial" w:hAnsi="Arial" w:eastAsia="Arial" w:cs="Arial"/>
+          <w:rFonts w:ascii="Arial" w:hAnsi="Arial" w:cs="Arial"/>
           <w:sz w:val="24"/>
           <w:szCs w:val="24"/>
-          <w:highlight w:val="none"/>
         </w:rPr>
       </w:r>
     </w:p>
     <w:p>
       <w:pPr>
-        <w:pStyle w:val="855"/>
+        <w:pStyle w:val="949"/>
         <w:pBdr/>
         <w:spacing/>
         <w:ind/>
@@ -4428,12 +4476,13 @@
         <w:rPr>
           <w:sz w:val="36"/>
           <w:szCs w:val="36"/>
+          <w14:ligatures w14:val="none"/>
         </w:rPr>
       </w:r>
     </w:p>
     <w:p>
       <w:pPr>
-        <w:pStyle w:val="855"/>
+        <w:pStyle w:val="949"/>
         <w:pBdr>
           <w:top w:val="none" w:color="000000" w:sz="4" w:space="0"/>
           <w:left w:val="none" w:color="000000" w:sz="4" w:space="0"/>
@@ -4462,13 +4511,13 @@
       </w:r>
       <w:r>
         <w:rPr>
-          <w:rFonts w:ascii="Arial" w:hAnsi="Arial" w:eastAsia="Arial" w:cs="Arial"/>
+          <w:rFonts w:ascii="Arial" w:hAnsi="Arial" w:cs="Arial"/>
         </w:rPr>
       </w:r>
     </w:p>
     <w:p>
       <w:pPr>
-        <w:pStyle w:val="916"/>
+        <w:pStyle w:val="1010"/>
         <w:numPr>
           <w:ilvl w:val="0"/>
           <w:numId w:val="40"/>
@@ -4502,13 +4551,13 @@
       </w:r>
       <w:r>
         <w:rPr>
-          <w:rFonts w:ascii="Arial" w:hAnsi="Arial" w:eastAsia="Arial" w:cs="Arial"/>
+          <w:rFonts w:ascii="Arial" w:hAnsi="Arial" w:cs="Arial"/>
         </w:rPr>
       </w:r>
     </w:p>
     <w:p>
       <w:pPr>
-        <w:pStyle w:val="855"/>
+        <w:pStyle w:val="949"/>
         <w:pBdr>
           <w:top w:val="none" w:color="000000" w:sz="4" w:space="0"/>
           <w:left w:val="none" w:color="000000" w:sz="4" w:space="0"/>
@@ -4537,13 +4586,13 @@
       </w:r>
       <w:r>
         <w:rPr>
-          <w:rFonts w:ascii="Arial" w:hAnsi="Arial" w:eastAsia="Arial" w:cs="Arial"/>
+          <w:rFonts w:ascii="Arial" w:hAnsi="Arial" w:cs="Arial"/>
         </w:rPr>
       </w:r>
     </w:p>
     <w:p>
       <w:pPr>
-        <w:pStyle w:val="916"/>
+        <w:pStyle w:val="1010"/>
         <w:numPr>
           <w:ilvl w:val="0"/>
           <w:numId w:val="41"/>
@@ -4581,30 +4630,7 @@
       </w:r>
       <w:r>
         <w:rPr>
-          <w:rFonts w:ascii="Arial" w:hAnsi="Arial" w:eastAsia="Arial" w:cs="Arial"/>
-        </w:rPr>
-      </w:r>
-      <w:r>
-        <w:rPr>
-          <w:rFonts w:ascii="Arial" w:hAnsi="Arial" w:eastAsia="Arial" w:cs="Arial"/>
-        </w:rPr>
-      </w:r>
-      <w:r>
-        <w:rPr>
-          <w:rFonts w:ascii="Arial" w:hAnsi="Arial" w:eastAsia="Arial" w:cs="Arial"/>
-          <w:highlight w:val="none"/>
-        </w:rPr>
-      </w:r>
-      <w:r>
-        <w:rPr>
-          <w:rFonts w:ascii="Arial" w:hAnsi="Arial" w:eastAsia="Arial" w:cs="Arial"/>
-          <w:highlight w:val="none"/>
-        </w:rPr>
-      </w:r>
-      <w:r>
-        <w:rPr>
-          <w:rFonts w:ascii="Arial" w:hAnsi="Arial" w:eastAsia="Arial" w:cs="Arial"/>
-          <w:highlight w:val="none"/>
+          <w:rFonts w:ascii="Arial" w:hAnsi="Arial" w:cs="Arial"/>
         </w:rPr>
       </w:r>
       <w:r>
@@ -4615,7 +4641,7 @@
     </w:p>
     <w:p>
       <w:pPr>
-        <w:pStyle w:val="916"/>
+        <w:pStyle w:val="1010"/>
         <w:numPr>
           <w:ilvl w:val="0"/>
           <w:numId w:val="42"/>
@@ -4665,13 +4691,13 @@
       </w:r>
       <w:r>
         <w:rPr>
-          <w:rFonts w:ascii="Arial" w:hAnsi="Arial" w:eastAsia="Arial" w:cs="Arial"/>
+          <w:rFonts w:ascii="Arial" w:hAnsi="Arial" w:cs="Arial"/>
         </w:rPr>
       </w:r>
     </w:p>
     <w:p>
       <w:pPr>
-        <w:pStyle w:val="916"/>
+        <w:pStyle w:val="1010"/>
         <w:numPr>
           <w:ilvl w:val="0"/>
           <w:numId w:val="43"/>
@@ -4707,12 +4733,12 @@
       <w:r>
         <w:rPr>
           <w:rFonts w:ascii="Arial" w:hAnsi="Arial" w:eastAsia="Arial" w:cs="Arial"/>
-          <w:highlight w:val="none"/>
         </w:rPr>
       </w:r>
       <w:r>
         <w:rPr>
-          <w:rFonts w:ascii="Arial" w:hAnsi="Arial" w:eastAsia="Arial" w:cs="Arial"/>
+          <w:rFonts w:ascii="Arial" w:hAnsi="Arial" w:cs="Arial"/>
+          <w:highlight w:val="none"/>
         </w:rPr>
       </w:r>
     </w:p>
@@ -4744,14 +4770,13 @@
       </w:r>
       <w:r>
         <w:rPr>
-          <w:rFonts w:ascii="Arial" w:hAnsi="Arial" w:eastAsia="Arial" w:cs="Arial"/>
-          <w:highlight w:val="none"/>
+          <w:rFonts w:ascii="Arial" w:hAnsi="Arial" w:cs="Arial"/>
         </w:rPr>
       </w:r>
     </w:p>
     <w:p>
       <w:pPr>
-        <w:pStyle w:val="855"/>
+        <w:pStyle w:val="949"/>
         <w:pBdr/>
         <w:spacing/>
         <w:ind/>
@@ -4778,13 +4803,13 @@
         <w:rPr>
           <w:sz w:val="36"/>
           <w:szCs w:val="36"/>
-          <w:highlight w:val="none"/>
         </w:rPr>
       </w:r>
       <w:r>
         <w:rPr>
           <w:sz w:val="36"/>
           <w:szCs w:val="36"/>
+          <w14:ligatures w14:val="none"/>
         </w:rPr>
       </w:r>
     </w:p>
@@ -4822,17 +4847,13 @@
       </w:r>
       <w:r>
         <w:rPr>
-          <w:rFonts w:ascii="Arial" w:hAnsi="Arial" w:eastAsia="Arial" w:cs="Arial"/>
-          <w:b/>
-          <w:color w:val="000000"/>
-          <w:sz w:val="24"/>
-          <w:highlight w:val="none"/>
+          <w:rFonts w:ascii="Arial" w:hAnsi="Arial" w:cs="Arial"/>
         </w:rPr>
       </w:r>
     </w:p>
     <w:p>
       <w:pPr>
-        <w:pStyle w:val="916"/>
+        <w:pStyle w:val="1010"/>
         <w:numPr>
           <w:ilvl w:val="0"/>
           <w:numId w:val="45"/>
@@ -4882,13 +4903,13 @@
       </w:r>
       <w:r>
         <w:rPr>
-          <w:rFonts w:ascii="Arial" w:hAnsi="Arial" w:eastAsia="Arial" w:cs="Arial"/>
+          <w:rFonts w:ascii="Arial" w:hAnsi="Arial" w:cs="Arial"/>
         </w:rPr>
       </w:r>
     </w:p>
     <w:p>
       <w:pPr>
-        <w:pStyle w:val="916"/>
+        <w:pStyle w:val="1010"/>
         <w:numPr>
           <w:ilvl w:val="0"/>
           <w:numId w:val="46"/>
@@ -4920,27 +4941,7 @@
       </w:r>
       <w:r>
         <w:rPr>
-          <w:rFonts w:ascii="Arial" w:hAnsi="Arial" w:eastAsia="Arial" w:cs="Arial"/>
-        </w:rPr>
-      </w:r>
-      <w:r>
-        <w:rPr>
-          <w:rFonts w:ascii="Arial" w:hAnsi="Arial" w:eastAsia="Arial" w:cs="Arial"/>
-        </w:rPr>
-      </w:r>
-      <w:r>
-        <w:rPr>
-          <w:rFonts w:ascii="Arial" w:hAnsi="Arial" w:eastAsia="Arial" w:cs="Arial"/>
-        </w:rPr>
-      </w:r>
-      <w:r>
-        <w:rPr>
-          <w:rFonts w:ascii="Arial" w:hAnsi="Arial" w:eastAsia="Arial" w:cs="Arial"/>
-        </w:rPr>
-      </w:r>
-      <w:r>
-        <w:rPr>
-          <w:rFonts w:ascii="Arial" w:hAnsi="Arial" w:eastAsia="Arial" w:cs="Arial"/>
+          <w:rFonts w:ascii="Arial" w:hAnsi="Arial" w:cs="Arial"/>
         </w:rPr>
       </w:r>
       <w:r>
@@ -4951,7 +4952,7 @@
     </w:p>
     <w:p>
       <w:pPr>
-        <w:pStyle w:val="916"/>
+        <w:pStyle w:val="1010"/>
         <w:numPr>
           <w:ilvl w:val="0"/>
           <w:numId w:val="47"/>
@@ -5001,13 +5002,13 @@
       </w:r>
       <w:r>
         <w:rPr>
-          <w:rFonts w:ascii="Arial" w:hAnsi="Arial" w:eastAsia="Arial" w:cs="Arial"/>
+          <w:rFonts w:ascii="Arial" w:hAnsi="Arial" w:cs="Arial"/>
         </w:rPr>
       </w:r>
     </w:p>
     <w:p>
       <w:pPr>
-        <w:pStyle w:val="916"/>
+        <w:pStyle w:val="1010"/>
         <w:numPr>
           <w:ilvl w:val="0"/>
           <w:numId w:val="54"/>
@@ -5043,20 +5044,17 @@
       <w:r>
         <w:rPr>
           <w:rFonts w:ascii="Arial" w:hAnsi="Arial" w:eastAsia="Arial" w:cs="Arial"/>
-          <w:i/>
-          <w:color w:val="000000"/>
-          <w:sz w:val="24"/>
         </w:rPr>
       </w:r>
       <w:r>
         <w:rPr>
-          <w:rFonts w:ascii="Arial" w:hAnsi="Arial" w:eastAsia="Arial" w:cs="Arial"/>
+          <w:rFonts w:ascii="Arial" w:hAnsi="Arial" w:cs="Arial"/>
         </w:rPr>
       </w:r>
     </w:p>
     <w:p>
       <w:pPr>
-        <w:pStyle w:val="916"/>
+        <w:pStyle w:val="1010"/>
         <w:numPr>
           <w:ilvl w:val="0"/>
           <w:numId w:val="51"/>
@@ -5089,7 +5087,7 @@
       </w:r>
       <w:r>
         <w:rPr>
-          <w:rFonts w:ascii="Arial" w:hAnsi="Arial" w:eastAsia="Arial" w:cs="Arial"/>
+          <w:rFonts w:ascii="Arial" w:hAnsi="Arial" w:cs="Arial"/>
           <w:sz w:val="24"/>
           <w:szCs w:val="24"/>
         </w:rPr>
@@ -5097,7 +5095,7 @@
     </w:p>
     <w:p>
       <w:pPr>
-        <w:pStyle w:val="916"/>
+        <w:pStyle w:val="1010"/>
         <w:numPr>
           <w:ilvl w:val="0"/>
           <w:numId w:val="49"/>
@@ -5129,13 +5127,13 @@
       </w:r>
       <w:r>
         <w:rPr>
-          <w:rFonts w:ascii="Arial" w:hAnsi="Arial" w:eastAsia="Arial" w:cs="Arial"/>
+          <w:rFonts w:ascii="Arial" w:hAnsi="Arial" w:cs="Arial"/>
         </w:rPr>
       </w:r>
     </w:p>
     <w:p>
       <w:pPr>
-        <w:pStyle w:val="916"/>
+        <w:pStyle w:val="1010"/>
         <w:numPr>
           <w:ilvl w:val="0"/>
           <w:numId w:val="49"/>
@@ -5167,7 +5165,7 @@
       </w:r>
       <w:r>
         <w:rPr>
-          <w:rFonts w:ascii="Arial" w:hAnsi="Arial" w:eastAsia="Arial" w:cs="Arial"/>
+          <w:rFonts w:ascii="Arial" w:hAnsi="Arial" w:cs="Arial"/>
         </w:rPr>
       </w:r>
     </w:p>
@@ -5195,6 +5193,11 @@
           <w:rFonts w:ascii="Arial" w:hAnsi="Arial" w:eastAsia="Arial" w:cs="Arial"/>
         </w:rPr>
       </w:r>
+      <w:r>
+        <w:rPr>
+          <w:rFonts w:ascii="Arial" w:hAnsi="Arial" w:cs="Arial"/>
+        </w:rPr>
+      </w:r>
     </w:p>
     <w:p>
       <w:pPr>
@@ -5226,7 +5229,13 @@
           <w:szCs w:val="24"/>
         </w:rPr>
       </w:r>
-      <w:r/>
+      <w:r>
+        <w:rPr>
+          <w:rFonts w:ascii="Arial" w:hAnsi="Arial" w:cs="Arial"/>
+          <w:sz w:val="24"/>
+          <w:szCs w:val="24"/>
+        </w:rPr>
+      </w:r>
     </w:p>
     <w:sectPr>
       <w:headerReference w:type="default" r:id="rId9"/>
@@ -5311,7 +5320,7 @@
 <w:hdr xmlns:wpc="http://schemas.microsoft.com/office/word/2010/wordprocessingCanvas" xmlns:mc="http://schemas.openxmlformats.org/markup-compatibility/2006" xmlns:o="urn:schemas-microsoft-com:office:office" xmlns:r="http://schemas.openxmlformats.org/officeDocument/2006/relationships" xmlns:m="http://schemas.openxmlformats.org/officeDocument/2006/math" xmlns:v="urn:schemas-microsoft-com:vml" xmlns:wp14="http://schemas.microsoft.com/office/word/2010/wordprocessingDrawing" xmlns:wp="http://schemas.openxmlformats.org/drawingml/2006/wordprocessingDrawing" xmlns:w10="urn:schemas-microsoft-com:office:word" xmlns:w="http://schemas.openxmlformats.org/wordprocessingml/2006/main" xmlns:w14="http://schemas.microsoft.com/office/word/2010/wordml" xmlns:w15="http://schemas.microsoft.com/office/word/2012/wordml" xmlns:wpg="http://schemas.microsoft.com/office/word/2010/wordprocessingGroup" xmlns:wpi="http://schemas.microsoft.com/office/word/2010/wordprocessingInk" xmlns:wne="http://schemas.microsoft.com/office/word/2006/wordml" xmlns:a="http://schemas.openxmlformats.org/drawingml/2006/main" xmlns:wps="http://schemas.microsoft.com/office/word/2010/wordprocessingShape" mc:Ignorable="w14 w15 wp14">
   <w:p>
     <w:pPr>
-      <w:pStyle w:val="887"/>
+      <w:pStyle w:val="981"/>
       <w:pBdr/>
       <w:spacing/>
       <w:ind/>
@@ -13718,9 +13727,9 @@
     <w:lsdException w:name="Bibliography" w:uiPriority="37"/>
     <w:lsdException w:name="TOC Heading" w:uiPriority="39" w:qFormat="1"/>
   </w:latentStyles>
-  <w:style w:type="table" w:styleId="727">
+  <w:style w:type="table" w:styleId="821">
     <w:name w:val="Table Grid"/>
-    <w:basedOn w:val="913"/>
+    <w:basedOn w:val="1007"/>
     <w:uiPriority w:val="59"/>
     <w:pPr>
       <w:pBdr/>
@@ -13917,9 +13926,9 @@
       </w:tcPr>
     </w:tblStylePr>
   </w:style>
-  <w:style w:type="table" w:styleId="728">
+  <w:style w:type="table" w:styleId="822">
     <w:name w:val="Table Grid Light"/>
-    <w:basedOn w:val="913"/>
+    <w:basedOn w:val="1007"/>
     <w:uiPriority w:val="59"/>
     <w:pPr>
       <w:pBdr/>
@@ -14116,9 +14125,9 @@
       </w:tcPr>
     </w:tblStylePr>
   </w:style>
-  <w:style w:type="table" w:styleId="729">
+  <w:style w:type="table" w:styleId="823">
     <w:name w:val="Plain Table 1"/>
-    <w:basedOn w:val="913"/>
+    <w:basedOn w:val="1007"/>
     <w:uiPriority w:val="59"/>
     <w:pPr>
       <w:pBdr/>
@@ -14341,9 +14350,9 @@
       </w:tcPr>
     </w:tblStylePr>
   </w:style>
-  <w:style w:type="table" w:styleId="730">
+  <w:style w:type="table" w:styleId="824">
     <w:name w:val="Plain Table 2"/>
-    <w:basedOn w:val="913"/>
+    <w:basedOn w:val="1007"/>
     <w:uiPriority w:val="59"/>
     <w:pPr>
       <w:pBdr/>
@@ -14574,9 +14583,9 @@
       </w:tcPr>
     </w:tblStylePr>
   </w:style>
-  <w:style w:type="table" w:styleId="731">
+  <w:style w:type="table" w:styleId="825">
     <w:name w:val="Plain Table 3"/>
-    <w:basedOn w:val="913"/>
+    <w:basedOn w:val="1007"/>
     <w:uiPriority w:val="99"/>
     <w:pPr>
       <w:pBdr/>
@@ -14804,9 +14813,9 @@
       </w:tcPr>
     </w:tblStylePr>
   </w:style>
-  <w:style w:type="table" w:styleId="732">
+  <w:style w:type="table" w:styleId="826">
     <w:name w:val="Plain Table 4"/>
-    <w:basedOn w:val="913"/>
+    <w:basedOn w:val="1007"/>
     <w:uiPriority w:val="99"/>
     <w:pPr>
       <w:pBdr/>
@@ -15020,9 +15029,9 @@
       </w:tcPr>
     </w:tblStylePr>
   </w:style>
-  <w:style w:type="table" w:styleId="733">
+  <w:style w:type="table" w:styleId="827">
     <w:name w:val="Plain Table 5"/>
-    <w:basedOn w:val="913"/>
+    <w:basedOn w:val="1007"/>
     <w:uiPriority w:val="99"/>
     <w:pPr>
       <w:pBdr/>
@@ -15253,9 +15262,9 @@
       </w:tcPr>
     </w:tblStylePr>
   </w:style>
-  <w:style w:type="table" w:styleId="734">
+  <w:style w:type="table" w:styleId="828">
     <w:name w:val="Grid Table 1 Light"/>
-    <w:basedOn w:val="913"/>
+    <w:basedOn w:val="1007"/>
     <w:uiPriority w:val="99"/>
     <w:pPr>
       <w:pBdr/>
@@ -15476,9 +15485,9 @@
       </w:tcPr>
     </w:tblStylePr>
   </w:style>
-  <w:style w:type="table" w:styleId="735">
+  <w:style w:type="table" w:styleId="829">
     <w:name w:val="Grid Table 1 Light - Accent 1"/>
-    <w:basedOn w:val="913"/>
+    <w:basedOn w:val="1007"/>
     <w:uiPriority w:val="99"/>
     <w:pPr>
       <w:pBdr/>
@@ -15699,9 +15708,9 @@
       </w:tcPr>
     </w:tblStylePr>
   </w:style>
-  <w:style w:type="table" w:styleId="736">
+  <w:style w:type="table" w:styleId="830">
     <w:name w:val="Grid Table 1 Light - Accent 2"/>
-    <w:basedOn w:val="913"/>
+    <w:basedOn w:val="1007"/>
     <w:uiPriority w:val="99"/>
     <w:pPr>
       <w:pBdr/>
@@ -15922,9 +15931,9 @@
       </w:tcPr>
     </w:tblStylePr>
   </w:style>
-  <w:style w:type="table" w:styleId="737">
+  <w:style w:type="table" w:styleId="831">
     <w:name w:val="Grid Table 1 Light - Accent 3"/>
-    <w:basedOn w:val="913"/>
+    <w:basedOn w:val="1007"/>
     <w:uiPriority w:val="99"/>
     <w:pPr>
       <w:pBdr/>
@@ -16145,9 +16154,9 @@
       </w:tcPr>
     </w:tblStylePr>
   </w:style>
-  <w:style w:type="table" w:styleId="738">
+  <w:style w:type="table" w:styleId="832">
     <w:name w:val="Grid Table 1 Light - Accent 4"/>
-    <w:basedOn w:val="913"/>
+    <w:basedOn w:val="1007"/>
     <w:uiPriority w:val="99"/>
     <w:pPr>
       <w:pBdr/>
@@ -16368,9 +16377,9 @@
       </w:tcPr>
     </w:tblStylePr>
   </w:style>
-  <w:style w:type="table" w:styleId="739">
+  <w:style w:type="table" w:styleId="833">
     <w:name w:val="Grid Table 1 Light - Accent 5"/>
-    <w:basedOn w:val="913"/>
+    <w:basedOn w:val="1007"/>
     <w:uiPriority w:val="99"/>
     <w:pPr>
       <w:pBdr/>
@@ -16591,9 +16600,9 @@
       </w:tcPr>
     </w:tblStylePr>
   </w:style>
-  <w:style w:type="table" w:styleId="740">
+  <w:style w:type="table" w:styleId="834">
     <w:name w:val="Grid Table 1 Light - Accent 6"/>
-    <w:basedOn w:val="913"/>
+    <w:basedOn w:val="1007"/>
     <w:uiPriority w:val="99"/>
     <w:pPr>
       <w:pBdr/>
@@ -16814,9 +16823,9 @@
       </w:tcPr>
     </w:tblStylePr>
   </w:style>
-  <w:style w:type="table" w:styleId="741">
+  <w:style w:type="table" w:styleId="835">
     <w:name w:val="Grid Table 2"/>
-    <w:basedOn w:val="913"/>
+    <w:basedOn w:val="1007"/>
     <w:uiPriority w:val="99"/>
     <w:pPr>
       <w:pBdr/>
@@ -17046,9 +17055,9 @@
       </w:tcPr>
     </w:tblStylePr>
   </w:style>
-  <w:style w:type="table" w:styleId="742">
+  <w:style w:type="table" w:styleId="836">
     <w:name w:val="Grid Table 2 - Accent 1"/>
-    <w:basedOn w:val="913"/>
+    <w:basedOn w:val="1007"/>
     <w:uiPriority w:val="99"/>
     <w:pPr>
       <w:pBdr/>
@@ -17278,9 +17287,9 @@
       </w:tcPr>
     </w:tblStylePr>
   </w:style>
-  <w:style w:type="table" w:styleId="743">
+  <w:style w:type="table" w:styleId="837">
     <w:name w:val="Grid Table 2 - Accent 2"/>
-    <w:basedOn w:val="913"/>
+    <w:basedOn w:val="1007"/>
     <w:uiPriority w:val="99"/>
     <w:pPr>
       <w:pBdr/>
@@ -17510,9 +17519,9 @@
       </w:tcPr>
     </w:tblStylePr>
   </w:style>
-  <w:style w:type="table" w:styleId="744">
+  <w:style w:type="table" w:styleId="838">
     <w:name w:val="Grid Table 2 - Accent 3"/>
-    <w:basedOn w:val="913"/>
+    <w:basedOn w:val="1007"/>
     <w:uiPriority w:val="99"/>
     <w:pPr>
       <w:pBdr/>
@@ -17742,9 +17751,9 @@
       </w:tcPr>
     </w:tblStylePr>
   </w:style>
-  <w:style w:type="table" w:styleId="745">
+  <w:style w:type="table" w:styleId="839">
     <w:name w:val="Grid Table 2 - Accent 4"/>
-    <w:basedOn w:val="913"/>
+    <w:basedOn w:val="1007"/>
     <w:uiPriority w:val="99"/>
     <w:pPr>
       <w:pBdr/>
@@ -17974,9 +17983,9 @@
       </w:tcPr>
     </w:tblStylePr>
   </w:style>
-  <w:style w:type="table" w:styleId="746">
+  <w:style w:type="table" w:styleId="840">
     <w:name w:val="Grid Table 2 - Accent 5"/>
-    <w:basedOn w:val="913"/>
+    <w:basedOn w:val="1007"/>
     <w:uiPriority w:val="99"/>
     <w:pPr>
       <w:pBdr/>
@@ -18206,9 +18215,9 @@
       </w:tcPr>
     </w:tblStylePr>
   </w:style>
-  <w:style w:type="table" w:styleId="747">
+  <w:style w:type="table" w:styleId="841">
     <w:name w:val="Grid Table 2 - Accent 6"/>
-    <w:basedOn w:val="913"/>
+    <w:basedOn w:val="1007"/>
     <w:uiPriority w:val="99"/>
     <w:pPr>
       <w:pBdr/>
@@ -18438,9 +18447,9 @@
       </w:tcPr>
     </w:tblStylePr>
   </w:style>
-  <w:style w:type="table" w:styleId="748">
+  <w:style w:type="table" w:styleId="842">
     <w:name w:val="Grid Table 3"/>
-    <w:basedOn w:val="913"/>
+    <w:basedOn w:val="1007"/>
     <w:uiPriority w:val="99"/>
     <w:pPr>
       <w:pBdr/>
@@ -18683,9 +18692,9 @@
       </w:tcPr>
     </w:tblStylePr>
   </w:style>
-  <w:style w:type="table" w:styleId="749">
+  <w:style w:type="table" w:styleId="843">
     <w:name w:val="Grid Table 3 - Accent 1"/>
-    <w:basedOn w:val="913"/>
+    <w:basedOn w:val="1007"/>
     <w:uiPriority w:val="99"/>
     <w:pPr>
       <w:pBdr/>
@@ -18928,9 +18937,9 @@
       </w:tcPr>
     </w:tblStylePr>
   </w:style>
-  <w:style w:type="table" w:styleId="750">
+  <w:style w:type="table" w:styleId="844">
     <w:name w:val="Grid Table 3 - Accent 2"/>
-    <w:basedOn w:val="913"/>
+    <w:basedOn w:val="1007"/>
     <w:uiPriority w:val="99"/>
     <w:pPr>
       <w:pBdr/>
@@ -19173,9 +19182,9 @@
       </w:tcPr>
     </w:tblStylePr>
   </w:style>
-  <w:style w:type="table" w:styleId="751">
+  <w:style w:type="table" w:styleId="845">
     <w:name w:val="Grid Table 3 - Accent 3"/>
-    <w:basedOn w:val="913"/>
+    <w:basedOn w:val="1007"/>
     <w:uiPriority w:val="99"/>
     <w:pPr>
       <w:pBdr/>
@@ -19418,9 +19427,9 @@
       </w:tcPr>
     </w:tblStylePr>
   </w:style>
-  <w:style w:type="table" w:styleId="752">
+  <w:style w:type="table" w:styleId="846">
     <w:name w:val="Grid Table 3 - Accent 4"/>
-    <w:basedOn w:val="913"/>
+    <w:basedOn w:val="1007"/>
     <w:uiPriority w:val="99"/>
     <w:pPr>
       <w:pBdr/>
@@ -19663,9 +19672,9 @@
       </w:tcPr>
     </w:tblStylePr>
   </w:style>
-  <w:style w:type="table" w:styleId="753">
+  <w:style w:type="table" w:styleId="847">
     <w:name w:val="Grid Table 3 - Accent 5"/>
-    <w:basedOn w:val="913"/>
+    <w:basedOn w:val="1007"/>
     <w:uiPriority w:val="99"/>
     <w:pPr>
       <w:pBdr/>
@@ -19908,9 +19917,9 @@
       </w:tcPr>
     </w:tblStylePr>
   </w:style>
-  <w:style w:type="table" w:styleId="754">
+  <w:style w:type="table" w:styleId="848">
     <w:name w:val="Grid Table 3 - Accent 6"/>
-    <w:basedOn w:val="913"/>
+    <w:basedOn w:val="1007"/>
     <w:uiPriority w:val="99"/>
     <w:pPr>
       <w:pBdr/>
@@ -20153,9 +20162,9 @@
       </w:tcPr>
     </w:tblStylePr>
   </w:style>
-  <w:style w:type="table" w:styleId="755">
+  <w:style w:type="table" w:styleId="849">
     <w:name w:val="Grid Table 4"/>
-    <w:basedOn w:val="913"/>
+    <w:basedOn w:val="1007"/>
     <w:uiPriority w:val="59"/>
     <w:pPr>
       <w:pBdr/>
@@ -20386,9 +20395,9 @@
       </w:tcPr>
     </w:tblStylePr>
   </w:style>
-  <w:style w:type="table" w:styleId="756">
+  <w:style w:type="table" w:styleId="850">
     <w:name w:val="Grid Table 4 - Accent 1"/>
-    <w:basedOn w:val="913"/>
+    <w:basedOn w:val="1007"/>
     <w:uiPriority w:val="59"/>
     <w:pPr>
       <w:pBdr/>
@@ -20619,9 +20628,9 @@
       </w:tcPr>
     </w:tblStylePr>
   </w:style>
-  <w:style w:type="table" w:styleId="757">
+  <w:style w:type="table" w:styleId="851">
     <w:name w:val="Grid Table 4 - Accent 2"/>
-    <w:basedOn w:val="913"/>
+    <w:basedOn w:val="1007"/>
     <w:uiPriority w:val="59"/>
     <w:pPr>
       <w:pBdr/>
@@ -20852,9 +20861,9 @@
       </w:tcPr>
     </w:tblStylePr>
   </w:style>
-  <w:style w:type="table" w:styleId="758">
+  <w:style w:type="table" w:styleId="852">
     <w:name w:val="Grid Table 4 - Accent 3"/>
-    <w:basedOn w:val="913"/>
+    <w:basedOn w:val="1007"/>
     <w:uiPriority w:val="59"/>
     <w:pPr>
       <w:pBdr/>
@@ -21085,9 +21094,9 @@
       </w:tcPr>
     </w:tblStylePr>
   </w:style>
-  <w:style w:type="table" w:styleId="759">
+  <w:style w:type="table" w:styleId="853">
     <w:name w:val="Grid Table 4 - Accent 4"/>
-    <w:basedOn w:val="913"/>
+    <w:basedOn w:val="1007"/>
     <w:uiPriority w:val="59"/>
     <w:pPr>
       <w:pBdr/>
@@ -21318,9 +21327,9 @@
       </w:tcPr>
     </w:tblStylePr>
   </w:style>
-  <w:style w:type="table" w:styleId="760">
+  <w:style w:type="table" w:styleId="854">
     <w:name w:val="Grid Table 4 - Accent 5"/>
-    <w:basedOn w:val="913"/>
+    <w:basedOn w:val="1007"/>
     <w:uiPriority w:val="59"/>
     <w:pPr>
       <w:pBdr/>
@@ -21551,9 +21560,9 @@
       </w:tcPr>
     </w:tblStylePr>
   </w:style>
-  <w:style w:type="table" w:styleId="761">
+  <w:style w:type="table" w:styleId="855">
     <w:name w:val="Grid Table 4 - Accent 6"/>
-    <w:basedOn w:val="913"/>
+    <w:basedOn w:val="1007"/>
     <w:uiPriority w:val="59"/>
     <w:pPr>
       <w:pBdr/>
@@ -21784,9 +21793,9 @@
       </w:tcPr>
     </w:tblStylePr>
   </w:style>
-  <w:style w:type="table" w:styleId="762">
+  <w:style w:type="table" w:styleId="856">
     <w:name w:val="Grid Table 5 Dark"/>
-    <w:basedOn w:val="913"/>
+    <w:basedOn w:val="1007"/>
     <w:uiPriority w:val="99"/>
     <w:pPr>
       <w:pBdr/>
@@ -22012,9 +22021,9 @@
       </w:tcPr>
     </w:tblStylePr>
   </w:style>
-  <w:style w:type="table" w:styleId="763">
+  <w:style w:type="table" w:styleId="857">
     <w:name w:val="Grid Table 5 Dark- Accent 1"/>
-    <w:basedOn w:val="913"/>
+    <w:basedOn w:val="1007"/>
     <w:uiPriority w:val="99"/>
     <w:pPr>
       <w:pBdr/>
@@ -22240,9 +22249,9 @@
       </w:tcPr>
     </w:tblStylePr>
   </w:style>
-  <w:style w:type="table" w:styleId="764">
+  <w:style w:type="table" w:styleId="858">
     <w:name w:val="Grid Table 5 Dark - Accent 2"/>
-    <w:basedOn w:val="913"/>
+    <w:basedOn w:val="1007"/>
     <w:uiPriority w:val="99"/>
     <w:pPr>
       <w:pBdr/>
@@ -22468,9 +22477,9 @@
       </w:tcPr>
     </w:tblStylePr>
   </w:style>
-  <w:style w:type="table" w:styleId="765">
+  <w:style w:type="table" w:styleId="859">
     <w:name w:val="Grid Table 5 Dark - Accent 3"/>
-    <w:basedOn w:val="913"/>
+    <w:basedOn w:val="1007"/>
     <w:uiPriority w:val="99"/>
     <w:pPr>
       <w:pBdr/>
@@ -22696,9 +22705,9 @@
       </w:tcPr>
     </w:tblStylePr>
   </w:style>
-  <w:style w:type="table" w:styleId="766">
+  <w:style w:type="table" w:styleId="860">
     <w:name w:val="Grid Table 5 Dark- Accent 4"/>
-    <w:basedOn w:val="913"/>
+    <w:basedOn w:val="1007"/>
     <w:uiPriority w:val="99"/>
     <w:pPr>
       <w:pBdr/>
@@ -22924,9 +22933,9 @@
       </w:tcPr>
     </w:tblStylePr>
   </w:style>
-  <w:style w:type="table" w:styleId="767">
+  <w:style w:type="table" w:styleId="861">
     <w:name w:val="Grid Table 5 Dark - Accent 5"/>
-    <w:basedOn w:val="913"/>
+    <w:basedOn w:val="1007"/>
     <w:uiPriority w:val="99"/>
     <w:pPr>
       <w:pBdr/>
@@ -23152,9 +23161,9 @@
       </w:tcPr>
     </w:tblStylePr>
   </w:style>
-  <w:style w:type="table" w:styleId="768">
+  <w:style w:type="table" w:styleId="862">
     <w:name w:val="Grid Table 5 Dark - Accent 6"/>
-    <w:basedOn w:val="913"/>
+    <w:basedOn w:val="1007"/>
     <w:uiPriority w:val="99"/>
     <w:pPr>
       <w:pBdr/>
@@ -23380,9 +23389,9 @@
       </w:tcPr>
     </w:tblStylePr>
   </w:style>
-  <w:style w:type="table" w:styleId="769">
+  <w:style w:type="table" w:styleId="863">
     <w:name w:val="Grid Table 6 Colorful"/>
-    <w:basedOn w:val="913"/>
+    <w:basedOn w:val="1007"/>
     <w:uiPriority w:val="99"/>
     <w:pPr>
       <w:pBdr/>
@@ -23610,9 +23619,9 @@
       </w:tcPr>
     </w:tblStylePr>
   </w:style>
-  <w:style w:type="table" w:styleId="770">
+  <w:style w:type="table" w:styleId="864">
     <w:name w:val="Grid Table 6 Colorful - Accent 1"/>
-    <w:basedOn w:val="913"/>
+    <w:basedOn w:val="1007"/>
     <w:uiPriority w:val="99"/>
     <w:pPr>
       <w:pBdr/>
@@ -23840,9 +23849,9 @@
       </w:tcPr>
     </w:tblStylePr>
   </w:style>
-  <w:style w:type="table" w:styleId="771">
+  <w:style w:type="table" w:styleId="865">
     <w:name w:val="Grid Table 6 Colorful - Accent 2"/>
-    <w:basedOn w:val="913"/>
+    <w:basedOn w:val="1007"/>
     <w:uiPriority w:val="99"/>
     <w:pPr>
       <w:pBdr/>
@@ -24070,9 +24079,9 @@
       </w:tcPr>
     </w:tblStylePr>
   </w:style>
-  <w:style w:type="table" w:styleId="772">
+  <w:style w:type="table" w:styleId="866">
     <w:name w:val="Grid Table 6 Colorful - Accent 3"/>
-    <w:basedOn w:val="913"/>
+    <w:basedOn w:val="1007"/>
     <w:uiPriority w:val="99"/>
     <w:pPr>
       <w:pBdr/>
@@ -24300,9 +24309,9 @@
       </w:tcPr>
     </w:tblStylePr>
   </w:style>
-  <w:style w:type="table" w:styleId="773">
+  <w:style w:type="table" w:styleId="867">
     <w:name w:val="Grid Table 6 Colorful - Accent 4"/>
-    <w:basedOn w:val="913"/>
+    <w:basedOn w:val="1007"/>
     <w:uiPriority w:val="99"/>
     <w:pPr>
       <w:pBdr/>
@@ -24530,9 +24539,9 @@
       </w:tcPr>
     </w:tblStylePr>
   </w:style>
-  <w:style w:type="table" w:styleId="774">
+  <w:style w:type="table" w:styleId="868">
     <w:name w:val="Grid Table 6 Colorful - Accent 5"/>
-    <w:basedOn w:val="913"/>
+    <w:basedOn w:val="1007"/>
     <w:uiPriority w:val="99"/>
     <w:pPr>
       <w:pBdr/>
@@ -24760,9 +24769,9 @@
       </w:tcPr>
     </w:tblStylePr>
   </w:style>
-  <w:style w:type="table" w:styleId="775">
+  <w:style w:type="table" w:styleId="869">
     <w:name w:val="Grid Table 6 Colorful - Accent 6"/>
-    <w:basedOn w:val="913"/>
+    <w:basedOn w:val="1007"/>
     <w:uiPriority w:val="99"/>
     <w:pPr>
       <w:pBdr/>
@@ -24990,9 +24999,9 @@
       </w:tcPr>
     </w:tblStylePr>
   </w:style>
-  <w:style w:type="table" w:styleId="776">
+  <w:style w:type="table" w:styleId="870">
     <w:name w:val="Grid Table 7 Colorful"/>
-    <w:basedOn w:val="913"/>
+    <w:basedOn w:val="1007"/>
     <w:uiPriority w:val="99"/>
     <w:pPr>
       <w:pBdr/>
@@ -25244,9 +25253,9 @@
       </w:tcPr>
     </w:tblStylePr>
   </w:style>
-  <w:style w:type="table" w:styleId="777">
+  <w:style w:type="table" w:styleId="871">
     <w:name w:val="Grid Table 7 Colorful - Accent 1"/>
-    <w:basedOn w:val="913"/>
+    <w:basedOn w:val="1007"/>
     <w:uiPriority w:val="99"/>
     <w:pPr>
       <w:pBdr/>
@@ -25498,9 +25507,9 @@
       </w:tcPr>
     </w:tblStylePr>
   </w:style>
-  <w:style w:type="table" w:styleId="778">
+  <w:style w:type="table" w:styleId="872">
     <w:name w:val="Grid Table 7 Colorful - Accent 2"/>
-    <w:basedOn w:val="913"/>
+    <w:basedOn w:val="1007"/>
     <w:uiPriority w:val="99"/>
     <w:pPr>
       <w:pBdr/>
@@ -25752,9 +25761,9 @@
       </w:tcPr>
     </w:tblStylePr>
   </w:style>
-  <w:style w:type="table" w:styleId="779">
+  <w:style w:type="table" w:styleId="873">
     <w:name w:val="Grid Table 7 Colorful - Accent 3"/>
-    <w:basedOn w:val="913"/>
+    <w:basedOn w:val="1007"/>
     <w:uiPriority w:val="99"/>
     <w:pPr>
       <w:pBdr/>
@@ -26006,9 +26015,9 @@
       </w:tcPr>
     </w:tblStylePr>
   </w:style>
-  <w:style w:type="table" w:styleId="780">
+  <w:style w:type="table" w:styleId="874">
     <w:name w:val="Grid Table 7 Colorful - Accent 4"/>
-    <w:basedOn w:val="913"/>
+    <w:basedOn w:val="1007"/>
     <w:uiPriority w:val="99"/>
     <w:pPr>
       <w:pBdr/>
@@ -26260,9 +26269,9 @@
       </w:tcPr>
     </w:tblStylePr>
   </w:style>
-  <w:style w:type="table" w:styleId="781">
+  <w:style w:type="table" w:styleId="875">
     <w:name w:val="Grid Table 7 Colorful - Accent 5"/>
-    <w:basedOn w:val="913"/>
+    <w:basedOn w:val="1007"/>
     <w:uiPriority w:val="99"/>
     <w:pPr>
       <w:pBdr/>
@@ -26514,9 +26523,9 @@
       </w:tcPr>
     </w:tblStylePr>
   </w:style>
-  <w:style w:type="table" w:styleId="782">
+  <w:style w:type="table" w:styleId="876">
     <w:name w:val="Grid Table 7 Colorful - Accent 6"/>
-    <w:basedOn w:val="913"/>
+    <w:basedOn w:val="1007"/>
     <w:uiPriority w:val="99"/>
     <w:pPr>
       <w:pBdr/>
@@ -26768,9 +26777,9 @@
       </w:tcPr>
     </w:tblStylePr>
   </w:style>
-  <w:style w:type="table" w:styleId="783">
+  <w:style w:type="table" w:styleId="877">
     <w:name w:val="List Table 1 Light"/>
-    <w:basedOn w:val="913"/>
+    <w:basedOn w:val="1007"/>
     <w:uiPriority w:val="99"/>
     <w:pPr>
       <w:pBdr/>
@@ -26984,9 +26993,9 @@
       </w:tcPr>
     </w:tblStylePr>
   </w:style>
-  <w:style w:type="table" w:styleId="784">
+  <w:style w:type="table" w:styleId="878">
     <w:name w:val="List Table 1 Light - Accent 1"/>
-    <w:basedOn w:val="913"/>
+    <w:basedOn w:val="1007"/>
     <w:uiPriority w:val="99"/>
     <w:pPr>
       <w:pBdr/>
@@ -27200,9 +27209,9 @@
       </w:tcPr>
     </w:tblStylePr>
   </w:style>
-  <w:style w:type="table" w:styleId="785">
+  <w:style w:type="table" w:styleId="879">
     <w:name w:val="List Table 1 Light - Accent 2"/>
-    <w:basedOn w:val="913"/>
+    <w:basedOn w:val="1007"/>
     <w:uiPriority w:val="99"/>
     <w:pPr>
       <w:pBdr/>
@@ -27416,9 +27425,9 @@
       </w:tcPr>
     </w:tblStylePr>
   </w:style>
-  <w:style w:type="table" w:styleId="786">
+  <w:style w:type="table" w:styleId="880">
     <w:name w:val="List Table 1 Light - Accent 3"/>
-    <w:basedOn w:val="913"/>
+    <w:basedOn w:val="1007"/>
     <w:uiPriority w:val="99"/>
     <w:pPr>
       <w:pBdr/>
@@ -27632,9 +27641,9 @@
       </w:tcPr>
     </w:tblStylePr>
   </w:style>
-  <w:style w:type="table" w:styleId="787">
+  <w:style w:type="table" w:styleId="881">
     <w:name w:val="List Table 1 Light - Accent 4"/>
-    <w:basedOn w:val="913"/>
+    <w:basedOn w:val="1007"/>
     <w:uiPriority w:val="99"/>
     <w:pPr>
       <w:pBdr/>
@@ -27848,9 +27857,9 @@
       </w:tcPr>
     </w:tblStylePr>
   </w:style>
-  <w:style w:type="table" w:styleId="788">
+  <w:style w:type="table" w:styleId="882">
     <w:name w:val="List Table 1 Light - Accent 5"/>
-    <w:basedOn w:val="913"/>
+    <w:basedOn w:val="1007"/>
     <w:uiPriority w:val="99"/>
     <w:pPr>
       <w:pBdr/>
@@ -28064,9 +28073,9 @@
       </w:tcPr>
     </w:tblStylePr>
   </w:style>
-  <w:style w:type="table" w:styleId="789">
+  <w:style w:type="table" w:styleId="883">
     <w:name w:val="List Table 1 Light - Accent 6"/>
-    <w:basedOn w:val="913"/>
+    <w:basedOn w:val="1007"/>
     <w:uiPriority w:val="99"/>
     <w:pPr>
       <w:pBdr/>
@@ -28280,9 +28289,9 @@
       </w:tcPr>
     </w:tblStylePr>
   </w:style>
-  <w:style w:type="table" w:styleId="790">
+  <w:style w:type="table" w:styleId="884">
     <w:name w:val="List Table 2"/>
-    <w:basedOn w:val="913"/>
+    <w:basedOn w:val="1007"/>
     <w:uiPriority w:val="99"/>
     <w:pPr>
       <w:pBdr/>
@@ -28518,9 +28527,9 @@
       </w:tcPr>
     </w:tblStylePr>
   </w:style>
-  <w:style w:type="table" w:styleId="791">
+  <w:style w:type="table" w:styleId="885">
     <w:name w:val="List Table 2 - Accent 1"/>
-    <w:basedOn w:val="913"/>
+    <w:basedOn w:val="1007"/>
     <w:uiPriority w:val="99"/>
     <w:pPr>
       <w:pBdr/>
@@ -28756,9 +28765,9 @@
       </w:tcPr>
     </w:tblStylePr>
   </w:style>
-  <w:style w:type="table" w:styleId="792">
+  <w:style w:type="table" w:styleId="886">
     <w:name w:val="List Table 2 - Accent 2"/>
-    <w:basedOn w:val="913"/>
+    <w:basedOn w:val="1007"/>
     <w:uiPriority w:val="99"/>
     <w:pPr>
       <w:pBdr/>
@@ -28994,9 +29003,9 @@
       </w:tcPr>
     </w:tblStylePr>
   </w:style>
-  <w:style w:type="table" w:styleId="793">
+  <w:style w:type="table" w:styleId="887">
     <w:name w:val="List Table 2 - Accent 3"/>
-    <w:basedOn w:val="913"/>
+    <w:basedOn w:val="1007"/>
     <w:uiPriority w:val="99"/>
     <w:pPr>
       <w:pBdr/>
@@ -29232,9 +29241,9 @@
       </w:tcPr>
     </w:tblStylePr>
   </w:style>
-  <w:style w:type="table" w:styleId="794">
+  <w:style w:type="table" w:styleId="888">
     <w:name w:val="List Table 2 - Accent 4"/>
-    <w:basedOn w:val="913"/>
+    <w:basedOn w:val="1007"/>
     <w:uiPriority w:val="99"/>
     <w:pPr>
       <w:pBdr/>
@@ -29470,9 +29479,9 @@
       </w:tcPr>
     </w:tblStylePr>
   </w:style>
-  <w:style w:type="table" w:styleId="795">
+  <w:style w:type="table" w:styleId="889">
     <w:name w:val="List Table 2 - Accent 5"/>
-    <w:basedOn w:val="913"/>
+    <w:basedOn w:val="1007"/>
     <w:uiPriority w:val="99"/>
     <w:pPr>
       <w:pBdr/>
@@ -29708,9 +29717,9 @@
       </w:tcPr>
     </w:tblStylePr>
   </w:style>
-  <w:style w:type="table" w:styleId="796">
+  <w:style w:type="table" w:styleId="890">
     <w:name w:val="List Table 2 - Accent 6"/>
-    <w:basedOn w:val="913"/>
+    <w:basedOn w:val="1007"/>
     <w:uiPriority w:val="99"/>
     <w:pPr>
       <w:pBdr/>
@@ -29946,9 +29955,9 @@
       </w:tcPr>
     </w:tblStylePr>
   </w:style>
-  <w:style w:type="table" w:styleId="797">
+  <w:style w:type="table" w:styleId="891">
     <w:name w:val="List Table 3"/>
-    <w:basedOn w:val="913"/>
+    <w:basedOn w:val="1007"/>
     <w:uiPriority w:val="99"/>
     <w:pPr>
       <w:pBdr/>
@@ -30174,9 +30183,9 @@
       </w:tcPr>
     </w:tblStylePr>
   </w:style>
-  <w:style w:type="table" w:styleId="798">
+  <w:style w:type="table" w:styleId="892">
     <w:name w:val="List Table 3 - Accent 1"/>
-    <w:basedOn w:val="913"/>
+    <w:basedOn w:val="1007"/>
     <w:uiPriority w:val="99"/>
     <w:pPr>
       <w:pBdr/>
@@ -30402,9 +30411,9 @@
       </w:tcPr>
     </w:tblStylePr>
   </w:style>
-  <w:style w:type="table" w:styleId="799">
+  <w:style w:type="table" w:styleId="893">
     <w:name w:val="List Table 3 - Accent 2"/>
-    <w:basedOn w:val="913"/>
+    <w:basedOn w:val="1007"/>
     <w:uiPriority w:val="99"/>
     <w:pPr>
       <w:pBdr/>
@@ -30630,9 +30639,9 @@
       </w:tcPr>
     </w:tblStylePr>
   </w:style>
-  <w:style w:type="table" w:styleId="800">
+  <w:style w:type="table" w:styleId="894">
     <w:name w:val="List Table 3 - Accent 3"/>
-    <w:basedOn w:val="913"/>
+    <w:basedOn w:val="1007"/>
     <w:uiPriority w:val="99"/>
     <w:pPr>
       <w:pBdr/>
@@ -30858,9 +30867,9 @@
       </w:tcPr>
     </w:tblStylePr>
   </w:style>
-  <w:style w:type="table" w:styleId="801">
+  <w:style w:type="table" w:styleId="895">
     <w:name w:val="List Table 3 - Accent 4"/>
-    <w:basedOn w:val="913"/>
+    <w:basedOn w:val="1007"/>
     <w:uiPriority w:val="99"/>
     <w:pPr>
       <w:pBdr/>
@@ -31086,9 +31095,9 @@
       </w:tcPr>
     </w:tblStylePr>
   </w:style>
-  <w:style w:type="table" w:styleId="802">
+  <w:style w:type="table" w:styleId="896">
     <w:name w:val="List Table 3 - Accent 5"/>
-    <w:basedOn w:val="913"/>
+    <w:basedOn w:val="1007"/>
     <w:uiPriority w:val="99"/>
     <w:pPr>
       <w:pBdr/>
@@ -31314,9 +31323,9 @@
       </w:tcPr>
     </w:tblStylePr>
   </w:style>
-  <w:style w:type="table" w:styleId="803">
+  <w:style w:type="table" w:styleId="897">
     <w:name w:val="List Table 3 - Accent 6"/>
-    <w:basedOn w:val="913"/>
+    <w:basedOn w:val="1007"/>
     <w:uiPriority w:val="99"/>
     <w:pPr>
       <w:pBdr/>
@@ -31542,9 +31551,9 @@
       </w:tcPr>
     </w:tblStylePr>
   </w:style>
-  <w:style w:type="table" w:styleId="804">
+  <w:style w:type="table" w:styleId="898">
     <w:name w:val="List Table 4"/>
-    <w:basedOn w:val="913"/>
+    <w:basedOn w:val="1007"/>
     <w:uiPriority w:val="99"/>
     <w:pPr>
       <w:pBdr/>
@@ -31767,9 +31776,9 @@
       </w:tcPr>
     </w:tblStylePr>
   </w:style>
-  <w:style w:type="table" w:styleId="805">
+  <w:style w:type="table" w:styleId="899">
     <w:name w:val="List Table 4 - Accent 1"/>
-    <w:basedOn w:val="913"/>
+    <w:basedOn w:val="1007"/>
     <w:uiPriority w:val="99"/>
     <w:pPr>
       <w:pBdr/>
@@ -31992,9 +32001,9 @@
       </w:tcPr>
     </w:tblStylePr>
   </w:style>
-  <w:style w:type="table" w:styleId="806">
+  <w:style w:type="table" w:styleId="900">
     <w:name w:val="List Table 4 - Accent 2"/>
-    <w:basedOn w:val="913"/>
+    <w:basedOn w:val="1007"/>
     <w:uiPriority w:val="99"/>
     <w:pPr>
       <w:pBdr/>
@@ -32217,9 +32226,9 @@
       </w:tcPr>
     </w:tblStylePr>
   </w:style>
-  <w:style w:type="table" w:styleId="807">
+  <w:style w:type="table" w:styleId="901">
     <w:name w:val="List Table 4 - Accent 3"/>
-    <w:basedOn w:val="913"/>
+    <w:basedOn w:val="1007"/>
     <w:uiPriority w:val="99"/>
     <w:pPr>
       <w:pBdr/>
@@ -32442,9 +32451,9 @@
       </w:tcPr>
     </w:tblStylePr>
   </w:style>
-  <w:style w:type="table" w:styleId="808">
+  <w:style w:type="table" w:styleId="902">
     <w:name w:val="List Table 4 - Accent 4"/>
-    <w:basedOn w:val="913"/>
+    <w:basedOn w:val="1007"/>
     <w:uiPriority w:val="99"/>
     <w:pPr>
       <w:pBdr/>
@@ -32667,9 +32676,9 @@
       </w:tcPr>
     </w:tblStylePr>
   </w:style>
-  <w:style w:type="table" w:styleId="809">
+  <w:style w:type="table" w:styleId="903">
     <w:name w:val="List Table 4 - Accent 5"/>
-    <w:basedOn w:val="913"/>
+    <w:basedOn w:val="1007"/>
     <w:uiPriority w:val="99"/>
     <w:pPr>
       <w:pBdr/>
@@ -32892,9 +32901,9 @@
       </w:tcPr>
     </w:tblStylePr>
   </w:style>
-  <w:style w:type="table" w:styleId="810">
+  <w:style w:type="table" w:styleId="904">
     <w:name w:val="List Table 4 - Accent 6"/>
-    <w:basedOn w:val="913"/>
+    <w:basedOn w:val="1007"/>
     <w:uiPriority w:val="99"/>
     <w:pPr>
       <w:pBdr/>
@@ -33117,9 +33126,9 @@
       </w:tcPr>
     </w:tblStylePr>
   </w:style>
-  <w:style w:type="table" w:styleId="811">
+  <w:style w:type="table" w:styleId="905">
     <w:name w:val="List Table 5 Dark"/>
-    <w:basedOn w:val="913"/>
+    <w:basedOn w:val="1007"/>
     <w:uiPriority w:val="99"/>
     <w:pPr>
       <w:pBdr/>
@@ -33359,9 +33368,9 @@
       </w:tcPr>
     </w:tblStylePr>
   </w:style>
-  <w:style w:type="table" w:styleId="812">
+  <w:style w:type="table" w:styleId="906">
     <w:name w:val="List Table 5 Dark - Accent 1"/>
-    <w:basedOn w:val="913"/>
+    <w:basedOn w:val="1007"/>
     <w:uiPriority w:val="99"/>
     <w:pPr>
       <w:pBdr/>
@@ -33601,9 +33610,9 @@
       </w:tcPr>
     </w:tblStylePr>
   </w:style>
-  <w:style w:type="table" w:styleId="813">
+  <w:style w:type="table" w:styleId="907">
     <w:name w:val="List Table 5 Dark - Accent 2"/>
-    <w:basedOn w:val="913"/>
+    <w:basedOn w:val="1007"/>
     <w:uiPriority w:val="99"/>
     <w:pPr>
       <w:pBdr/>
@@ -33843,9 +33852,9 @@
       </w:tcPr>
     </w:tblStylePr>
   </w:style>
-  <w:style w:type="table" w:styleId="814">
+  <w:style w:type="table" w:styleId="908">
     <w:name w:val="List Table 5 Dark - Accent 3"/>
-    <w:basedOn w:val="913"/>
+    <w:basedOn w:val="1007"/>
     <w:uiPriority w:val="99"/>
     <w:pPr>
       <w:pBdr/>
@@ -34085,9 +34094,9 @@
       </w:tcPr>
     </w:tblStylePr>
   </w:style>
-  <w:style w:type="table" w:styleId="815">
+  <w:style w:type="table" w:styleId="909">
     <w:name w:val="List Table 5 Dark - Accent 4"/>
-    <w:basedOn w:val="913"/>
+    <w:basedOn w:val="1007"/>
     <w:uiPriority w:val="99"/>
     <w:pPr>
       <w:pBdr/>
@@ -34327,9 +34336,9 @@
       </w:tcPr>
     </w:tblStylePr>
   </w:style>
-  <w:style w:type="table" w:styleId="816">
+  <w:style w:type="table" w:styleId="910">
     <w:name w:val="List Table 5 Dark - Accent 5"/>
-    <w:basedOn w:val="913"/>
+    <w:basedOn w:val="1007"/>
     <w:uiPriority w:val="99"/>
     <w:pPr>
       <w:pBdr/>
@@ -34569,9 +34578,9 @@
       </w:tcPr>
     </w:tblStylePr>
   </w:style>
-  <w:style w:type="table" w:styleId="817">
+  <w:style w:type="table" w:styleId="911">
     <w:name w:val="List Table 5 Dark - Accent 6"/>
-    <w:basedOn w:val="913"/>
+    <w:basedOn w:val="1007"/>
     <w:uiPriority w:val="99"/>
     <w:pPr>
       <w:pBdr/>
@@ -34811,9 +34820,9 @@
       </w:tcPr>
     </w:tblStylePr>
   </w:style>
-  <w:style w:type="table" w:styleId="818">
+  <w:style w:type="table" w:styleId="912">
     <w:name w:val="List Table 6 Colorful"/>
-    <w:basedOn w:val="913"/>
+    <w:basedOn w:val="1007"/>
     <w:uiPriority w:val="99"/>
     <w:pPr>
       <w:pBdr/>
@@ -35034,9 +35043,9 @@
       </w:tcPr>
     </w:tblStylePr>
   </w:style>
-  <w:style w:type="table" w:styleId="819">
+  <w:style w:type="table" w:styleId="913">
     <w:name w:val="List Table 6 Colorful - Accent 1"/>
-    <w:basedOn w:val="913"/>
+    <w:basedOn w:val="1007"/>
     <w:uiPriority w:val="99"/>
     <w:pPr>
       <w:pBdr/>
@@ -35257,9 +35266,9 @@
       </w:tcPr>
     </w:tblStylePr>
   </w:style>
-  <w:style w:type="table" w:styleId="820">
+  <w:style w:type="table" w:styleId="914">
     <w:name w:val="List Table 6 Colorful - Accent 2"/>
-    <w:basedOn w:val="913"/>
+    <w:basedOn w:val="1007"/>
     <w:uiPriority w:val="99"/>
     <w:pPr>
       <w:pBdr/>
@@ -35480,9 +35489,9 @@
       </w:tcPr>
     </w:tblStylePr>
   </w:style>
-  <w:style w:type="table" w:styleId="821">
+  <w:style w:type="table" w:styleId="915">
     <w:name w:val="List Table 6 Colorful - Accent 3"/>
-    <w:basedOn w:val="913"/>
+    <w:basedOn w:val="1007"/>
     <w:uiPriority w:val="99"/>
     <w:pPr>
       <w:pBdr/>
@@ -35703,9 +35712,9 @@
       </w:tcPr>
     </w:tblStylePr>
   </w:style>
-  <w:style w:type="table" w:styleId="822">
+  <w:style w:type="table" w:styleId="916">
     <w:name w:val="List Table 6 Colorful - Accent 4"/>
-    <w:basedOn w:val="913"/>
+    <w:basedOn w:val="1007"/>
     <w:uiPriority w:val="99"/>
     <w:pPr>
       <w:pBdr/>
@@ -35926,9 +35935,9 @@
       </w:tcPr>
     </w:tblStylePr>
   </w:style>
-  <w:style w:type="table" w:styleId="823">
+  <w:style w:type="table" w:styleId="917">
     <w:name w:val="List Table 6 Colorful - Accent 5"/>
-    <w:basedOn w:val="913"/>
+    <w:basedOn w:val="1007"/>
     <w:uiPriority w:val="99"/>
     <w:pPr>
       <w:pBdr/>
@@ -36149,9 +36158,9 @@
       </w:tcPr>
     </w:tblStylePr>
   </w:style>
-  <w:style w:type="table" w:styleId="824">
+  <w:style w:type="table" w:styleId="918">
     <w:name w:val="List Table 6 Colorful - Accent 6"/>
-    <w:basedOn w:val="913"/>
+    <w:basedOn w:val="1007"/>
     <w:uiPriority w:val="99"/>
     <w:pPr>
       <w:pBdr/>
@@ -36372,9 +36381,9 @@
       </w:tcPr>
     </w:tblStylePr>
   </w:style>
-  <w:style w:type="table" w:styleId="825">
+  <w:style w:type="table" w:styleId="919">
     <w:name w:val="List Table 7 Colorful"/>
-    <w:basedOn w:val="913"/>
+    <w:basedOn w:val="1007"/>
     <w:uiPriority w:val="99"/>
     <w:pPr>
       <w:pBdr/>
@@ -36628,9 +36637,9 @@
       </w:tcPr>
     </w:tblStylePr>
   </w:style>
-  <w:style w:type="table" w:styleId="826">
+  <w:style w:type="table" w:styleId="920">
     <w:name w:val="List Table 7 Colorful - Accent 1"/>
-    <w:basedOn w:val="913"/>
+    <w:basedOn w:val="1007"/>
     <w:uiPriority w:val="99"/>
     <w:pPr>
       <w:pBdr/>
@@ -36884,9 +36893,9 @@
       </w:tcPr>
     </w:tblStylePr>
   </w:style>
-  <w:style w:type="table" w:styleId="827">
+  <w:style w:type="table" w:styleId="921">
     <w:name w:val="List Table 7 Colorful - Accent 2"/>
-    <w:basedOn w:val="913"/>
+    <w:basedOn w:val="1007"/>
     <w:uiPriority w:val="99"/>
     <w:pPr>
       <w:pBdr/>
@@ -37140,9 +37149,9 @@
       </w:tcPr>
     </w:tblStylePr>
   </w:style>
-  <w:style w:type="table" w:styleId="828">
+  <w:style w:type="table" w:styleId="922">
     <w:name w:val="List Table 7 Colorful - Accent 3"/>
-    <w:basedOn w:val="913"/>
+    <w:basedOn w:val="1007"/>
     <w:uiPriority w:val="99"/>
     <w:pPr>
       <w:pBdr/>
@@ -37396,9 +37405,9 @@
       </w:tcPr>
     </w:tblStylePr>
   </w:style>
-  <w:style w:type="table" w:styleId="829">
+  <w:style w:type="table" w:styleId="923">
     <w:name w:val="List Table 7 Colorful - Accent 4"/>
-    <w:basedOn w:val="913"/>
+    <w:basedOn w:val="1007"/>
     <w:uiPriority w:val="99"/>
     <w:pPr>
       <w:pBdr/>
@@ -37652,9 +37661,9 @@
       </w:tcPr>
     </w:tblStylePr>
   </w:style>
-  <w:style w:type="table" w:styleId="830">
+  <w:style w:type="table" w:styleId="924">
     <w:name w:val="List Table 7 Colorful - Accent 5"/>
-    <w:basedOn w:val="913"/>
+    <w:basedOn w:val="1007"/>
     <w:uiPriority w:val="99"/>
     <w:pPr>
       <w:pBdr/>
@@ -37908,9 +37917,9 @@
       </w:tcPr>
     </w:tblStylePr>
   </w:style>
-  <w:style w:type="table" w:styleId="831">
+  <w:style w:type="table" w:styleId="925">
     <w:name w:val="List Table 7 Colorful - Accent 6"/>
-    <w:basedOn w:val="913"/>
+    <w:basedOn w:val="1007"/>
     <w:uiPriority w:val="99"/>
     <w:pPr>
       <w:pBdr/>
@@ -38164,9 +38173,9 @@
       </w:tcPr>
     </w:tblStylePr>
   </w:style>
-  <w:style w:type="table" w:styleId="832">
+  <w:style w:type="table" w:styleId="926">
     <w:name w:val="Lined - Accent"/>
-    <w:basedOn w:val="913"/>
+    <w:basedOn w:val="1007"/>
     <w:uiPriority w:val="99"/>
     <w:pPr>
       <w:pBdr/>
@@ -38401,9 +38410,9 @@
       </w:tcPr>
     </w:tblStylePr>
   </w:style>
-  <w:style w:type="table" w:styleId="833">
+  <w:style w:type="table" w:styleId="927">
     <w:name w:val="Lined - Accent 1"/>
-    <w:basedOn w:val="913"/>
+    <w:basedOn w:val="1007"/>
     <w:uiPriority w:val="99"/>
     <w:pPr>
       <w:pBdr/>
@@ -38638,9 +38647,9 @@
       </w:tcPr>
     </w:tblStylePr>
   </w:style>
-  <w:style w:type="table" w:styleId="834">
+  <w:style w:type="table" w:styleId="928">
     <w:name w:val="Lined - Accent 2"/>
-    <w:basedOn w:val="913"/>
+    <w:basedOn w:val="1007"/>
     <w:uiPriority w:val="99"/>
     <w:pPr>
       <w:pBdr/>
@@ -38875,9 +38884,9 @@
       </w:tcPr>
     </w:tblStylePr>
   </w:style>
-  <w:style w:type="table" w:styleId="835">
+  <w:style w:type="table" w:styleId="929">
     <w:name w:val="Lined - Accent 3"/>
-    <w:basedOn w:val="913"/>
+    <w:basedOn w:val="1007"/>
     <w:uiPriority w:val="99"/>
     <w:pPr>
       <w:pBdr/>
@@ -39112,9 +39121,9 @@
       </w:tcPr>
     </w:tblStylePr>
   </w:style>
-  <w:style w:type="table" w:styleId="836">
+  <w:style w:type="table" w:styleId="930">
     <w:name w:val="Lined - Accent 4"/>
-    <w:basedOn w:val="913"/>
+    <w:basedOn w:val="1007"/>
     <w:uiPriority w:val="99"/>
     <w:pPr>
       <w:pBdr/>
@@ -39349,9 +39358,9 @@
       </w:tcPr>
     </w:tblStylePr>
   </w:style>
-  <w:style w:type="table" w:styleId="837">
+  <w:style w:type="table" w:styleId="931">
     <w:name w:val="Lined - Accent 5"/>
-    <w:basedOn w:val="913"/>
+    <w:basedOn w:val="1007"/>
     <w:uiPriority w:val="99"/>
     <w:pPr>
       <w:pBdr/>
@@ -39586,9 +39595,9 @@
       </w:tcPr>
     </w:tblStylePr>
   </w:style>
-  <w:style w:type="table" w:styleId="838">
+  <w:style w:type="table" w:styleId="932">
     <w:name w:val="Lined - Accent 6"/>
-    <w:basedOn w:val="913"/>
+    <w:basedOn w:val="1007"/>
     <w:uiPriority w:val="99"/>
     <w:pPr>
       <w:pBdr/>
@@ -39823,9 +39832,9 @@
       </w:tcPr>
     </w:tblStylePr>
   </w:style>
-  <w:style w:type="table" w:styleId="839">
+  <w:style w:type="table" w:styleId="933">
     <w:name w:val="Bordered &amp; Lined - Accent"/>
-    <w:basedOn w:val="913"/>
+    <w:basedOn w:val="1007"/>
     <w:uiPriority w:val="99"/>
     <w:pPr>
       <w:pBdr/>
@@ -40067,9 +40076,9 @@
       </w:tcPr>
     </w:tblStylePr>
   </w:style>
-  <w:style w:type="table" w:styleId="840">
+  <w:style w:type="table" w:styleId="934">
     <w:name w:val="Bordered &amp; Lined - Accent 1"/>
-    <w:basedOn w:val="913"/>
+    <w:basedOn w:val="1007"/>
     <w:uiPriority w:val="99"/>
     <w:pPr>
       <w:pBdr/>
@@ -40311,9 +40320,9 @@
       </w:tcPr>
     </w:tblStylePr>
   </w:style>
-  <w:style w:type="table" w:styleId="841">
+  <w:style w:type="table" w:styleId="935">
     <w:name w:val="Bordered &amp; Lined - Accent 2"/>
-    <w:basedOn w:val="913"/>
+    <w:basedOn w:val="1007"/>
     <w:uiPriority w:val="99"/>
     <w:pPr>
       <w:pBdr/>
@@ -40555,9 +40564,9 @@
       </w:tcPr>
     </w:tblStylePr>
   </w:style>
-  <w:style w:type="table" w:styleId="842">
+  <w:style w:type="table" w:styleId="936">
     <w:name w:val="Bordered &amp; Lined - Accent 3"/>
-    <w:basedOn w:val="913"/>
+    <w:basedOn w:val="1007"/>
     <w:uiPriority w:val="99"/>
     <w:pPr>
       <w:pBdr/>
@@ -40799,9 +40808,9 @@
       </w:tcPr>
     </w:tblStylePr>
   </w:style>
-  <w:style w:type="table" w:styleId="843">
+  <w:style w:type="table" w:styleId="937">
     <w:name w:val="Bordered &amp; Lined - Accent 4"/>
-    <w:basedOn w:val="913"/>
+    <w:basedOn w:val="1007"/>
     <w:uiPriority w:val="99"/>
     <w:pPr>
       <w:pBdr/>
@@ -41043,9 +41052,9 @@
       </w:tcPr>
     </w:tblStylePr>
   </w:style>
-  <w:style w:type="table" w:styleId="844">
+  <w:style w:type="table" w:styleId="938">
     <w:name w:val="Bordered &amp; Lined - Accent 5"/>
-    <w:basedOn w:val="913"/>
+    <w:basedOn w:val="1007"/>
     <w:uiPriority w:val="99"/>
     <w:pPr>
       <w:pBdr/>
@@ -41287,9 +41296,9 @@
       </w:tcPr>
     </w:tblStylePr>
   </w:style>
-  <w:style w:type="table" w:styleId="845">
+  <w:style w:type="table" w:styleId="939">
     <w:name w:val="Bordered &amp; Lined - Accent 6"/>
-    <w:basedOn w:val="913"/>
+    <w:basedOn w:val="1007"/>
     <w:uiPriority w:val="99"/>
     <w:pPr>
       <w:pBdr/>
@@ -41531,9 +41540,9 @@
       </w:tcPr>
     </w:tblStylePr>
   </w:style>
-  <w:style w:type="table" w:styleId="846">
+  <w:style w:type="table" w:styleId="940">
     <w:name w:val="Bordered"/>
-    <w:basedOn w:val="913"/>
+    <w:basedOn w:val="1007"/>
     <w:uiPriority w:val="99"/>
     <w:pPr>
       <w:pBdr/>
@@ -41762,9 +41771,9 @@
       </w:tcPr>
     </w:tblStylePr>
   </w:style>
-  <w:style w:type="table" w:styleId="847">
+  <w:style w:type="table" w:styleId="941">
     <w:name w:val="Bordered - Accent 1"/>
-    <w:basedOn w:val="913"/>
+    <w:basedOn w:val="1007"/>
     <w:uiPriority w:val="99"/>
     <w:pPr>
       <w:pBdr/>
@@ -41993,9 +42002,9 @@
       </w:tcPr>
     </w:tblStylePr>
   </w:style>
-  <w:style w:type="table" w:styleId="848">
+  <w:style w:type="table" w:styleId="942">
     <w:name w:val="Bordered - Accent 2"/>
-    <w:basedOn w:val="913"/>
+    <w:basedOn w:val="1007"/>
     <w:uiPriority w:val="99"/>
     <w:pPr>
       <w:pBdr/>
@@ -42224,9 +42233,9 @@
       </w:tcPr>
     </w:tblStylePr>
   </w:style>
-  <w:style w:type="table" w:styleId="849">
+  <w:style w:type="table" w:styleId="943">
     <w:name w:val="Bordered - Accent 3"/>
-    <w:basedOn w:val="913"/>
+    <w:basedOn w:val="1007"/>
     <w:uiPriority w:val="99"/>
     <w:pPr>
       <w:pBdr/>
@@ -42455,9 +42464,9 @@
       </w:tcPr>
     </w:tblStylePr>
   </w:style>
-  <w:style w:type="table" w:styleId="850">
+  <w:style w:type="table" w:styleId="944">
     <w:name w:val="Bordered - Accent 4"/>
-    <w:basedOn w:val="913"/>
+    <w:basedOn w:val="1007"/>
     <w:uiPriority w:val="99"/>
     <w:pPr>
       <w:pBdr/>
@@ -42686,9 +42695,9 @@
       </w:tcPr>
     </w:tblStylePr>
   </w:style>
-  <w:style w:type="table" w:styleId="851">
+  <w:style w:type="table" w:styleId="945">
     <w:name w:val="Bordered - Accent 5"/>
-    <w:basedOn w:val="913"/>
+    <w:basedOn w:val="1007"/>
     <w:uiPriority w:val="99"/>
     <w:pPr>
       <w:pBdr/>
@@ -42917,9 +42926,9 @@
       </w:tcPr>
     </w:tblStylePr>
   </w:style>
-  <w:style w:type="table" w:styleId="852">
+  <w:style w:type="table" w:styleId="946">
     <w:name w:val="Bordered - Accent 6"/>
-    <w:basedOn w:val="913"/>
+    <w:basedOn w:val="1007"/>
     <w:uiPriority w:val="99"/>
     <w:pPr>
       <w:pBdr/>
@@ -43148,11 +43157,11 @@
       </w:tcPr>
     </w:tblStylePr>
   </w:style>
-  <w:style w:type="paragraph" w:styleId="853">
+  <w:style w:type="paragraph" w:styleId="947">
     <w:name w:val="Heading 1"/>
-    <w:basedOn w:val="912"/>
-    <w:next w:val="912"/>
-    <w:link w:val="863"/>
+    <w:basedOn w:val="1006"/>
+    <w:next w:val="1006"/>
+    <w:link w:val="957"/>
     <w:uiPriority w:val="9"/>
     <w:qFormat/>
     <w:pPr>
@@ -43170,11 +43179,11 @@
       <w:szCs w:val="40"/>
     </w:rPr>
   </w:style>
-  <w:style w:type="paragraph" w:styleId="854">
+  <w:style w:type="paragraph" w:styleId="948">
     <w:name w:val="Heading 2"/>
-    <w:basedOn w:val="912"/>
-    <w:next w:val="912"/>
-    <w:link w:val="864"/>
+    <w:basedOn w:val="1006"/>
+    <w:next w:val="1006"/>
+    <w:link w:val="958"/>
     <w:uiPriority w:val="9"/>
     <w:unhideWhenUsed/>
     <w:qFormat/>
@@ -43193,11 +43202,11 @@
       <w:szCs w:val="32"/>
     </w:rPr>
   </w:style>
-  <w:style w:type="paragraph" w:styleId="855">
+  <w:style w:type="paragraph" w:styleId="949">
     <w:name w:val="Heading 3"/>
-    <w:basedOn w:val="912"/>
-    <w:next w:val="912"/>
-    <w:link w:val="865"/>
+    <w:basedOn w:val="1006"/>
+    <w:next w:val="1006"/>
+    <w:link w:val="959"/>
     <w:uiPriority w:val="9"/>
     <w:unhideWhenUsed/>
     <w:qFormat/>
@@ -43216,11 +43225,11 @@
       <w:szCs w:val="28"/>
     </w:rPr>
   </w:style>
-  <w:style w:type="paragraph" w:styleId="856">
+  <w:style w:type="paragraph" w:styleId="950">
     <w:name w:val="Heading 4"/>
-    <w:basedOn w:val="912"/>
-    <w:next w:val="912"/>
-    <w:link w:val="866"/>
+    <w:basedOn w:val="1006"/>
+    <w:next w:val="1006"/>
+    <w:link w:val="960"/>
     <w:uiPriority w:val="9"/>
     <w:unhideWhenUsed/>
     <w:qFormat/>
@@ -43239,11 +43248,11 @@
       <w:color w:val="0f4761" w:themeColor="accent1" w:themeShade="BF"/>
     </w:rPr>
   </w:style>
-  <w:style w:type="paragraph" w:styleId="857">
+  <w:style w:type="paragraph" w:styleId="951">
     <w:name w:val="Heading 5"/>
-    <w:basedOn w:val="912"/>
-    <w:next w:val="912"/>
-    <w:link w:val="867"/>
+    <w:basedOn w:val="1006"/>
+    <w:next w:val="1006"/>
+    <w:link w:val="961"/>
     <w:uiPriority w:val="9"/>
     <w:unhideWhenUsed/>
     <w:qFormat/>
@@ -43260,11 +43269,11 @@
       <w:color w:val="0f4761" w:themeColor="accent1" w:themeShade="BF"/>
     </w:rPr>
   </w:style>
-  <w:style w:type="paragraph" w:styleId="858">
+  <w:style w:type="paragraph" w:styleId="952">
     <w:name w:val="Heading 6"/>
-    <w:basedOn w:val="912"/>
-    <w:next w:val="912"/>
-    <w:link w:val="868"/>
+    <w:basedOn w:val="1006"/>
+    <w:next w:val="1006"/>
+    <w:link w:val="962"/>
     <w:uiPriority w:val="9"/>
     <w:unhideWhenUsed/>
     <w:qFormat/>
@@ -43283,11 +43292,11 @@
       <w:color w:val="595959" w:themeColor="text1" w:themeTint="A6"/>
     </w:rPr>
   </w:style>
-  <w:style w:type="paragraph" w:styleId="859">
+  <w:style w:type="paragraph" w:styleId="953">
     <w:name w:val="Heading 7"/>
-    <w:basedOn w:val="912"/>
-    <w:next w:val="912"/>
-    <w:link w:val="869"/>
+    <w:basedOn w:val="1006"/>
+    <w:next w:val="1006"/>
+    <w:link w:val="963"/>
     <w:uiPriority w:val="9"/>
     <w:unhideWhenUsed/>
     <w:qFormat/>
@@ -43304,11 +43313,11 @@
       <w:color w:val="595959" w:themeColor="text1" w:themeTint="A6"/>
     </w:rPr>
   </w:style>
-  <w:style w:type="paragraph" w:styleId="860">
+  <w:style w:type="paragraph" w:styleId="954">
     <w:name w:val="Heading 8"/>
-    <w:basedOn w:val="912"/>
-    <w:next w:val="912"/>
-    <w:link w:val="870"/>
+    <w:basedOn w:val="1006"/>
+    <w:next w:val="1006"/>
+    <w:link w:val="964"/>
     <w:uiPriority w:val="9"/>
     <w:unhideWhenUsed/>
     <w:qFormat/>
@@ -43327,11 +43336,11 @@
       <w:color w:val="272727" w:themeColor="text1" w:themeTint="D8"/>
     </w:rPr>
   </w:style>
-  <w:style w:type="paragraph" w:styleId="861">
+  <w:style w:type="paragraph" w:styleId="955">
     <w:name w:val="Heading 9"/>
-    <w:basedOn w:val="912"/>
-    <w:next w:val="912"/>
-    <w:link w:val="871"/>
+    <w:basedOn w:val="1006"/>
+    <w:next w:val="1006"/>
+    <w:link w:val="965"/>
     <w:uiPriority w:val="9"/>
     <w:unhideWhenUsed/>
     <w:qFormat/>
@@ -43350,7 +43359,7 @@
       <w:color w:val="272727" w:themeColor="text1" w:themeTint="D8"/>
     </w:rPr>
   </w:style>
-  <w:style w:type="character" w:styleId="862" w:default="1">
+  <w:style w:type="character" w:styleId="956" w:default="1">
     <w:name w:val="Default Paragraph Font"/>
     <w:uiPriority w:val="1"/>
     <w:semiHidden/>
@@ -43361,10 +43370,10 @@
       <w:ind/>
     </w:pPr>
   </w:style>
-  <w:style w:type="character" w:styleId="863">
+  <w:style w:type="character" w:styleId="957">
     <w:name w:val="Heading 1 Char"/>
-    <w:basedOn w:val="862"/>
-    <w:link w:val="853"/>
+    <w:basedOn w:val="956"/>
+    <w:link w:val="947"/>
     <w:uiPriority w:val="9"/>
     <w:pPr>
       <w:pBdr/>
@@ -43378,10 +43387,10 @@
       <w:szCs w:val="40"/>
     </w:rPr>
   </w:style>
-  <w:style w:type="character" w:styleId="864">
+  <w:style w:type="character" w:styleId="958">
     <w:name w:val="Heading 2 Char"/>
-    <w:basedOn w:val="862"/>
-    <w:link w:val="854"/>
+    <w:basedOn w:val="956"/>
+    <w:link w:val="948"/>
     <w:uiPriority w:val="9"/>
     <w:pPr>
       <w:pBdr/>
@@ -43395,10 +43404,10 @@
       <w:szCs w:val="32"/>
     </w:rPr>
   </w:style>
-  <w:style w:type="character" w:styleId="865">
+  <w:style w:type="character" w:styleId="959">
     <w:name w:val="Heading 3 Char"/>
-    <w:basedOn w:val="862"/>
-    <w:link w:val="855"/>
+    <w:basedOn w:val="956"/>
+    <w:link w:val="949"/>
     <w:uiPriority w:val="9"/>
     <w:pPr>
       <w:pBdr/>
@@ -43412,10 +43421,10 @@
       <w:szCs w:val="28"/>
     </w:rPr>
   </w:style>
-  <w:style w:type="character" w:styleId="866">
+  <w:style w:type="character" w:styleId="960">
     <w:name w:val="Heading 4 Char"/>
-    <w:basedOn w:val="862"/>
-    <w:link w:val="856"/>
+    <w:basedOn w:val="956"/>
+    <w:link w:val="950"/>
     <w:uiPriority w:val="9"/>
     <w:pPr>
       <w:pBdr/>
@@ -43429,10 +43438,10 @@
       <w:color w:val="0f4761" w:themeColor="accent1" w:themeShade="BF"/>
     </w:rPr>
   </w:style>
-  <w:style w:type="character" w:styleId="867">
+  <w:style w:type="character" w:styleId="961">
     <w:name w:val="Heading 5 Char"/>
-    <w:basedOn w:val="862"/>
-    <w:link w:val="857"/>
+    <w:basedOn w:val="956"/>
+    <w:link w:val="951"/>
     <w:uiPriority w:val="9"/>
     <w:pPr>
       <w:pBdr/>
@@ -43444,10 +43453,10 @@
       <w:color w:val="0f4761" w:themeColor="accent1" w:themeShade="BF"/>
     </w:rPr>
   </w:style>
-  <w:style w:type="character" w:styleId="868">
+  <w:style w:type="character" w:styleId="962">
     <w:name w:val="Heading 6 Char"/>
-    <w:basedOn w:val="862"/>
-    <w:link w:val="858"/>
+    <w:basedOn w:val="956"/>
+    <w:link w:val="952"/>
     <w:uiPriority w:val="9"/>
     <w:pPr>
       <w:pBdr/>
@@ -43461,10 +43470,10 @@
       <w:color w:val="595959" w:themeColor="text1" w:themeTint="A6"/>
     </w:rPr>
   </w:style>
-  <w:style w:type="character" w:styleId="869">
+  <w:style w:type="character" w:styleId="963">
     <w:name w:val="Heading 7 Char"/>
-    <w:basedOn w:val="862"/>
-    <w:link w:val="859"/>
+    <w:basedOn w:val="956"/>
+    <w:link w:val="953"/>
     <w:uiPriority w:val="9"/>
     <w:pPr>
       <w:pBdr/>
@@ -43476,10 +43485,10 @@
       <w:color w:val="595959" w:themeColor="text1" w:themeTint="A6"/>
     </w:rPr>
   </w:style>
-  <w:style w:type="character" w:styleId="870">
+  <w:style w:type="character" w:styleId="964">
     <w:name w:val="Heading 8 Char"/>
-    <w:basedOn w:val="862"/>
-    <w:link w:val="860"/>
+    <w:basedOn w:val="956"/>
+    <w:link w:val="954"/>
     <w:uiPriority w:val="9"/>
     <w:pPr>
       <w:pBdr/>
@@ -43493,10 +43502,10 @@
       <w:color w:val="272727" w:themeColor="text1" w:themeTint="D8"/>
     </w:rPr>
   </w:style>
-  <w:style w:type="character" w:styleId="871">
+  <w:style w:type="character" w:styleId="965">
     <w:name w:val="Heading 9 Char"/>
-    <w:basedOn w:val="862"/>
-    <w:link w:val="861"/>
+    <w:basedOn w:val="956"/>
+    <w:link w:val="955"/>
     <w:uiPriority w:val="9"/>
     <w:pPr>
       <w:pBdr/>
@@ -43510,11 +43519,11 @@
       <w:color w:val="272727" w:themeColor="text1" w:themeTint="D8"/>
     </w:rPr>
   </w:style>
-  <w:style w:type="paragraph" w:styleId="872">
+  <w:style w:type="paragraph" w:styleId="966">
     <w:name w:val="Title"/>
-    <w:basedOn w:val="912"/>
-    <w:next w:val="912"/>
-    <w:link w:val="873"/>
+    <w:basedOn w:val="1006"/>
+    <w:next w:val="1006"/>
+    <w:link w:val="967"/>
     <w:uiPriority w:val="10"/>
     <w:qFormat/>
     <w:pPr>
@@ -43530,10 +43539,10 @@
       <w:szCs w:val="56"/>
     </w:rPr>
   </w:style>
-  <w:style w:type="character" w:styleId="873">
+  <w:style w:type="character" w:styleId="967">
     <w:name w:val="Title Char"/>
-    <w:basedOn w:val="862"/>
-    <w:link w:val="872"/>
+    <w:basedOn w:val="956"/>
+    <w:link w:val="966"/>
     <w:uiPriority w:val="10"/>
     <w:pPr>
       <w:pBdr/>
@@ -43547,11 +43556,11 @@
       <w:szCs w:val="56"/>
     </w:rPr>
   </w:style>
-  <w:style w:type="paragraph" w:styleId="874">
+  <w:style w:type="paragraph" w:styleId="968">
     <w:name w:val="Subtitle"/>
-    <w:basedOn w:val="912"/>
-    <w:next w:val="912"/>
-    <w:link w:val="875"/>
+    <w:basedOn w:val="1006"/>
+    <w:next w:val="1006"/>
+    <w:link w:val="969"/>
     <w:uiPriority w:val="11"/>
     <w:qFormat/>
     <w:pPr>
@@ -43569,10 +43578,10 @@
       <w:szCs w:val="28"/>
     </w:rPr>
   </w:style>
-  <w:style w:type="character" w:styleId="875">
+  <w:style w:type="character" w:styleId="969">
     <w:name w:val="Subtitle Char"/>
-    <w:basedOn w:val="862"/>
-    <w:link w:val="874"/>
+    <w:basedOn w:val="956"/>
+    <w:link w:val="968"/>
     <w:uiPriority w:val="11"/>
     <w:pPr>
       <w:pBdr/>
@@ -43586,11 +43595,11 @@
       <w:szCs w:val="28"/>
     </w:rPr>
   </w:style>
-  <w:style w:type="paragraph" w:styleId="876">
+  <w:style w:type="paragraph" w:styleId="970">
     <w:name w:val="Quote"/>
-    <w:basedOn w:val="912"/>
-    <w:next w:val="912"/>
-    <w:link w:val="877"/>
+    <w:basedOn w:val="1006"/>
+    <w:next w:val="1006"/>
+    <w:link w:val="971"/>
     <w:uiPriority w:val="29"/>
     <w:qFormat/>
     <w:pPr>
@@ -43605,10 +43614,10 @@
       <w:color w:val="404040" w:themeColor="text1" w:themeTint="BF"/>
     </w:rPr>
   </w:style>
-  <w:style w:type="character" w:styleId="877">
+  <w:style w:type="character" w:styleId="971">
     <w:name w:val="Quote Char"/>
-    <w:basedOn w:val="862"/>
-    <w:link w:val="876"/>
+    <w:basedOn w:val="956"/>
+    <w:link w:val="970"/>
     <w:uiPriority w:val="29"/>
     <w:pPr>
       <w:pBdr/>
@@ -43621,9 +43630,9 @@
       <w:color w:val="404040" w:themeColor="text1" w:themeTint="BF"/>
     </w:rPr>
   </w:style>
-  <w:style w:type="character" w:styleId="878">
+  <w:style w:type="character" w:styleId="972">
     <w:name w:val="Intense Emphasis"/>
-    <w:basedOn w:val="862"/>
+    <w:basedOn w:val="956"/>
     <w:uiPriority w:val="21"/>
     <w:qFormat/>
     <w:pPr>
@@ -43637,11 +43646,11 @@
       <w:color w:val="0f4761" w:themeColor="accent1" w:themeShade="BF"/>
     </w:rPr>
   </w:style>
-  <w:style w:type="paragraph" w:styleId="879">
+  <w:style w:type="paragraph" w:styleId="973">
     <w:name w:val="Intense Quote"/>
-    <w:basedOn w:val="912"/>
-    <w:next w:val="912"/>
-    <w:link w:val="880"/>
+    <w:basedOn w:val="1006"/>
+    <w:next w:val="1006"/>
+    <w:link w:val="974"/>
     <w:uiPriority w:val="30"/>
     <w:qFormat/>
     <w:pPr>
@@ -43659,10 +43668,10 @@
       <w:color w:val="0f4761" w:themeColor="accent1" w:themeShade="BF"/>
     </w:rPr>
   </w:style>
-  <w:style w:type="character" w:styleId="880">
+  <w:style w:type="character" w:styleId="974">
     <w:name w:val="Intense Quote Char"/>
-    <w:basedOn w:val="862"/>
-    <w:link w:val="879"/>
+    <w:basedOn w:val="956"/>
+    <w:link w:val="973"/>
     <w:uiPriority w:val="30"/>
     <w:pPr>
       <w:pBdr/>
@@ -43675,9 +43684,9 @@
       <w:color w:val="0f4761" w:themeColor="accent1" w:themeShade="BF"/>
     </w:rPr>
   </w:style>
-  <w:style w:type="character" w:styleId="881">
+  <w:style w:type="character" w:styleId="975">
     <w:name w:val="Intense Reference"/>
-    <w:basedOn w:val="862"/>
+    <w:basedOn w:val="956"/>
     <w:uiPriority w:val="32"/>
     <w:qFormat/>
     <w:pPr>
@@ -43693,9 +43702,9 @@
       <w:spacing w:val="5"/>
     </w:rPr>
   </w:style>
-  <w:style w:type="character" w:styleId="882">
+  <w:style w:type="character" w:styleId="976">
     <w:name w:val="Subtle Emphasis"/>
-    <w:basedOn w:val="862"/>
+    <w:basedOn w:val="956"/>
     <w:uiPriority w:val="19"/>
     <w:qFormat/>
     <w:pPr>
@@ -43709,9 +43718,9 @@
       <w:color w:val="404040" w:themeColor="text1" w:themeTint="BF"/>
     </w:rPr>
   </w:style>
-  <w:style w:type="character" w:styleId="883">
+  <w:style w:type="character" w:styleId="977">
     <w:name w:val="Emphasis"/>
-    <w:basedOn w:val="862"/>
+    <w:basedOn w:val="956"/>
     <w:uiPriority w:val="20"/>
     <w:qFormat/>
     <w:pPr>
@@ -43724,9 +43733,9 @@
       <w:iCs/>
     </w:rPr>
   </w:style>
-  <w:style w:type="character" w:styleId="884">
+  <w:style w:type="character" w:styleId="978">
     <w:name w:val="Strong"/>
-    <w:basedOn w:val="862"/>
+    <w:basedOn w:val="956"/>
     <w:uiPriority w:val="22"/>
     <w:qFormat/>
     <w:pPr>
@@ -43739,9 +43748,9 @@
       <w:bCs/>
     </w:rPr>
   </w:style>
-  <w:style w:type="character" w:styleId="885">
+  <w:style w:type="character" w:styleId="979">
     <w:name w:val="Subtle Reference"/>
-    <w:basedOn w:val="862"/>
+    <w:basedOn w:val="956"/>
     <w:uiPriority w:val="31"/>
     <w:qFormat/>
     <w:pPr>
@@ -43754,9 +43763,9 @@
       <w:color w:val="5a5a5a" w:themeColor="text1" w:themeTint="A5"/>
     </w:rPr>
   </w:style>
-  <w:style w:type="character" w:styleId="886">
+  <w:style w:type="character" w:styleId="980">
     <w:name w:val="Book Title"/>
-    <w:basedOn w:val="862"/>
+    <w:basedOn w:val="956"/>
     <w:uiPriority w:val="33"/>
     <w:qFormat/>
     <w:pPr>
@@ -43772,10 +43781,10 @@
       <w:spacing w:val="5"/>
     </w:rPr>
   </w:style>
-  <w:style w:type="paragraph" w:styleId="887">
+  <w:style w:type="paragraph" w:styleId="981">
     <w:name w:val="Header"/>
-    <w:basedOn w:val="912"/>
-    <w:link w:val="888"/>
+    <w:basedOn w:val="1006"/>
+    <w:link w:val="982"/>
     <w:uiPriority w:val="99"/>
     <w:unhideWhenUsed/>
     <w:pPr>
@@ -43788,10 +43797,10 @@
       <w:ind/>
     </w:pPr>
   </w:style>
-  <w:style w:type="character" w:styleId="888">
+  <w:style w:type="character" w:styleId="982">
     <w:name w:val="Header Char"/>
-    <w:basedOn w:val="862"/>
-    <w:link w:val="887"/>
+    <w:basedOn w:val="956"/>
+    <w:link w:val="981"/>
     <w:uiPriority w:val="99"/>
     <w:pPr>
       <w:pBdr/>
@@ -43799,10 +43808,10 @@
       <w:ind/>
     </w:pPr>
   </w:style>
-  <w:style w:type="paragraph" w:styleId="889">
+  <w:style w:type="paragraph" w:styleId="983">
     <w:name w:val="Footer"/>
-    <w:basedOn w:val="912"/>
-    <w:link w:val="890"/>
+    <w:basedOn w:val="1006"/>
+    <w:link w:val="984"/>
     <w:uiPriority w:val="99"/>
     <w:unhideWhenUsed/>
     <w:pPr>
@@ -43815,10 +43824,10 @@
       <w:ind/>
     </w:pPr>
   </w:style>
-  <w:style w:type="character" w:styleId="890">
+  <w:style w:type="character" w:styleId="984">
     <w:name w:val="Footer Char"/>
-    <w:basedOn w:val="862"/>
-    <w:link w:val="889"/>
+    <w:basedOn w:val="956"/>
+    <w:link w:val="983"/>
     <w:uiPriority w:val="99"/>
     <w:pPr>
       <w:pBdr/>
@@ -43826,10 +43835,10 @@
       <w:ind/>
     </w:pPr>
   </w:style>
-  <w:style w:type="paragraph" w:styleId="891">
+  <w:style w:type="paragraph" w:styleId="985">
     <w:name w:val="Caption"/>
-    <w:basedOn w:val="912"/>
-    <w:next w:val="912"/>
+    <w:basedOn w:val="1006"/>
+    <w:next w:val="1006"/>
     <w:uiPriority w:val="35"/>
     <w:unhideWhenUsed/>
     <w:qFormat/>
@@ -43846,10 +43855,10 @@
       <w:szCs w:val="18"/>
     </w:rPr>
   </w:style>
-  <w:style w:type="paragraph" w:styleId="892">
+  <w:style w:type="paragraph" w:styleId="986">
     <w:name w:val="footnote text"/>
-    <w:basedOn w:val="912"/>
-    <w:link w:val="893"/>
+    <w:basedOn w:val="1006"/>
+    <w:link w:val="987"/>
     <w:uiPriority w:val="99"/>
     <w:semiHidden/>
     <w:unhideWhenUsed/>
@@ -43863,10 +43872,10 @@
       <w:szCs w:val="20"/>
     </w:rPr>
   </w:style>
-  <w:style w:type="character" w:styleId="893">
+  <w:style w:type="character" w:styleId="987">
     <w:name w:val="Footnote Text Char"/>
-    <w:basedOn w:val="862"/>
-    <w:link w:val="892"/>
+    <w:basedOn w:val="956"/>
+    <w:link w:val="986"/>
     <w:uiPriority w:val="99"/>
     <w:semiHidden/>
     <w:pPr>
@@ -43879,9 +43888,9 @@
       <w:szCs w:val="20"/>
     </w:rPr>
   </w:style>
-  <w:style w:type="character" w:styleId="894">
+  <w:style w:type="character" w:styleId="988">
     <w:name w:val="footnote reference"/>
-    <w:basedOn w:val="862"/>
+    <w:basedOn w:val="956"/>
     <w:uiPriority w:val="99"/>
     <w:semiHidden/>
     <w:unhideWhenUsed/>
@@ -43894,10 +43903,10 @@
       <w:vertAlign w:val="superscript"/>
     </w:rPr>
   </w:style>
-  <w:style w:type="paragraph" w:styleId="895">
+  <w:style w:type="paragraph" w:styleId="989">
     <w:name w:val="endnote text"/>
-    <w:basedOn w:val="912"/>
-    <w:link w:val="896"/>
+    <w:basedOn w:val="1006"/>
+    <w:link w:val="990"/>
     <w:uiPriority w:val="99"/>
     <w:semiHidden/>
     <w:unhideWhenUsed/>
@@ -43911,10 +43920,10 @@
       <w:szCs w:val="20"/>
     </w:rPr>
   </w:style>
-  <w:style w:type="character" w:styleId="896">
+  <w:style w:type="character" w:styleId="990">
     <w:name w:val="Endnote Text Char"/>
-    <w:basedOn w:val="862"/>
-    <w:link w:val="895"/>
+    <w:basedOn w:val="956"/>
+    <w:link w:val="989"/>
     <w:uiPriority w:val="99"/>
     <w:semiHidden/>
     <w:pPr>
@@ -43927,9 +43936,9 @@
       <w:szCs w:val="20"/>
     </w:rPr>
   </w:style>
-  <w:style w:type="character" w:styleId="897">
+  <w:style w:type="character" w:styleId="991">
     <w:name w:val="endnote reference"/>
-    <w:basedOn w:val="862"/>
+    <w:basedOn w:val="956"/>
     <w:uiPriority w:val="99"/>
     <w:semiHidden/>
     <w:unhideWhenUsed/>
@@ -43942,9 +43951,9 @@
       <w:vertAlign w:val="superscript"/>
     </w:rPr>
   </w:style>
-  <w:style w:type="character" w:styleId="898">
+  <w:style w:type="character" w:styleId="992">
     <w:name w:val="Hyperlink"/>
-    <w:basedOn w:val="862"/>
+    <w:basedOn w:val="956"/>
     <w:uiPriority w:val="99"/>
     <w:unhideWhenUsed/>
     <w:pPr>
@@ -43957,9 +43966,9 @@
       <w:u w:val="single"/>
     </w:rPr>
   </w:style>
-  <w:style w:type="character" w:styleId="899">
+  <w:style w:type="character" w:styleId="993">
     <w:name w:val="FollowedHyperlink"/>
-    <w:basedOn w:val="862"/>
+    <w:basedOn w:val="956"/>
     <w:uiPriority w:val="99"/>
     <w:semiHidden/>
     <w:unhideWhenUsed/>
@@ -43973,10 +43982,10 @@
       <w:u w:val="single"/>
     </w:rPr>
   </w:style>
-  <w:style w:type="paragraph" w:styleId="900">
+  <w:style w:type="paragraph" w:styleId="994">
     <w:name w:val="toc 1"/>
-    <w:basedOn w:val="912"/>
-    <w:next w:val="912"/>
+    <w:basedOn w:val="1006"/>
+    <w:next w:val="1006"/>
     <w:uiPriority w:val="39"/>
     <w:unhideWhenUsed/>
     <w:pPr>
@@ -43985,10 +43994,10 @@
       <w:ind/>
     </w:pPr>
   </w:style>
-  <w:style w:type="paragraph" w:styleId="901">
+  <w:style w:type="paragraph" w:styleId="995">
     <w:name w:val="toc 2"/>
-    <w:basedOn w:val="912"/>
-    <w:next w:val="912"/>
+    <w:basedOn w:val="1006"/>
+    <w:next w:val="1006"/>
     <w:uiPriority w:val="39"/>
     <w:unhideWhenUsed/>
     <w:pPr>
@@ -43997,10 +44006,10 @@
       <w:ind w:left="220"/>
     </w:pPr>
   </w:style>
-  <w:style w:type="paragraph" w:styleId="902">
+  <w:style w:type="paragraph" w:styleId="996">
     <w:name w:val="toc 3"/>
-    <w:basedOn w:val="912"/>
-    <w:next w:val="912"/>
+    <w:basedOn w:val="1006"/>
+    <w:next w:val="1006"/>
     <w:uiPriority w:val="39"/>
     <w:unhideWhenUsed/>
     <w:pPr>
@@ -44009,10 +44018,10 @@
       <w:ind w:left="440"/>
     </w:pPr>
   </w:style>
-  <w:style w:type="paragraph" w:styleId="903">
+  <w:style w:type="paragraph" w:styleId="997">
     <w:name w:val="toc 4"/>
-    <w:basedOn w:val="912"/>
-    <w:next w:val="912"/>
+    <w:basedOn w:val="1006"/>
+    <w:next w:val="1006"/>
     <w:uiPriority w:val="39"/>
     <w:unhideWhenUsed/>
     <w:pPr>
@@ -44021,10 +44030,10 @@
       <w:ind w:left="660"/>
     </w:pPr>
   </w:style>
-  <w:style w:type="paragraph" w:styleId="904">
+  <w:style w:type="paragraph" w:styleId="998">
     <w:name w:val="toc 5"/>
-    <w:basedOn w:val="912"/>
-    <w:next w:val="912"/>
+    <w:basedOn w:val="1006"/>
+    <w:next w:val="1006"/>
     <w:uiPriority w:val="39"/>
     <w:unhideWhenUsed/>
     <w:pPr>
@@ -44033,10 +44042,10 @@
       <w:ind w:left="880"/>
     </w:pPr>
   </w:style>
-  <w:style w:type="paragraph" w:styleId="905">
+  <w:style w:type="paragraph" w:styleId="999">
     <w:name w:val="toc 6"/>
-    <w:basedOn w:val="912"/>
-    <w:next w:val="912"/>
+    <w:basedOn w:val="1006"/>
+    <w:next w:val="1006"/>
     <w:uiPriority w:val="39"/>
     <w:unhideWhenUsed/>
     <w:pPr>
@@ -44045,10 +44054,10 @@
       <w:ind w:left="1100"/>
     </w:pPr>
   </w:style>
-  <w:style w:type="paragraph" w:styleId="906">
+  <w:style w:type="paragraph" w:styleId="1000">
     <w:name w:val="toc 7"/>
-    <w:basedOn w:val="912"/>
-    <w:next w:val="912"/>
+    <w:basedOn w:val="1006"/>
+    <w:next w:val="1006"/>
     <w:uiPriority w:val="39"/>
     <w:unhideWhenUsed/>
     <w:pPr>
@@ -44057,10 +44066,10 @@
       <w:ind w:left="1320"/>
     </w:pPr>
   </w:style>
-  <w:style w:type="paragraph" w:styleId="907">
+  <w:style w:type="paragraph" w:styleId="1001">
     <w:name w:val="toc 8"/>
-    <w:basedOn w:val="912"/>
-    <w:next w:val="912"/>
+    <w:basedOn w:val="1006"/>
+    <w:next w:val="1006"/>
     <w:uiPriority w:val="39"/>
     <w:unhideWhenUsed/>
     <w:pPr>
@@ -44069,10 +44078,10 @@
       <w:ind w:left="1540"/>
     </w:pPr>
   </w:style>
-  <w:style w:type="paragraph" w:styleId="908">
+  <w:style w:type="paragraph" w:styleId="1002">
     <w:name w:val="toc 9"/>
-    <w:basedOn w:val="912"/>
-    <w:next w:val="912"/>
+    <w:basedOn w:val="1006"/>
+    <w:next w:val="1006"/>
     <w:uiPriority w:val="39"/>
     <w:unhideWhenUsed/>
     <w:pPr>
@@ -44081,9 +44090,9 @@
       <w:ind w:left="1760"/>
     </w:pPr>
   </w:style>
-  <w:style w:type="character" w:styleId="909">
+  <w:style w:type="character" w:styleId="1003">
     <w:name w:val="Placeholder Text"/>
-    <w:basedOn w:val="862"/>
+    <w:basedOn w:val="956"/>
     <w:uiPriority w:val="99"/>
     <w:semiHidden/>
     <w:pPr>
@@ -44095,7 +44104,7 @@
       <w:color w:val="666666"/>
     </w:rPr>
   </w:style>
-  <w:style w:type="paragraph" w:styleId="910">
+  <w:style w:type="paragraph" w:styleId="1004">
     <w:name w:val="TOC Heading"/>
     <w:uiPriority w:val="39"/>
     <w:unhideWhenUsed/>
@@ -44105,10 +44114,10 @@
       <w:ind/>
     </w:pPr>
   </w:style>
-  <w:style w:type="paragraph" w:styleId="911">
+  <w:style w:type="paragraph" w:styleId="1005">
     <w:name w:val="table of figures"/>
-    <w:basedOn w:val="912"/>
-    <w:next w:val="912"/>
+    <w:basedOn w:val="1006"/>
+    <w:next w:val="1006"/>
     <w:uiPriority w:val="99"/>
     <w:unhideWhenUsed/>
     <w:pPr>
@@ -44117,7 +44126,7 @@
       <w:ind/>
     </w:pPr>
   </w:style>
-  <w:style w:type="paragraph" w:styleId="912" w:default="1">
+  <w:style w:type="paragraph" w:styleId="1006" w:default="1">
     <w:name w:val="Normal"/>
     <w:qFormat/>
     <w:pPr>
@@ -44126,7 +44135,7 @@
       <w:ind/>
     </w:pPr>
   </w:style>
-  <w:style w:type="table" w:styleId="913" w:default="1">
+  <w:style w:type="table" w:styleId="1007" w:default="1">
     <w:name w:val="Normal Table"/>
     <w:uiPriority w:val="99"/>
     <w:semiHidden/>
@@ -44319,7 +44328,7 @@
       </w:tcPr>
     </w:tblStylePr>
   </w:style>
-  <w:style w:type="numbering" w:styleId="914" w:default="1">
+  <w:style w:type="numbering" w:styleId="1008" w:default="1">
     <w:name w:val="No List"/>
     <w:uiPriority w:val="99"/>
     <w:semiHidden/>
@@ -44330,9 +44339,9 @@
       <w:ind/>
     </w:pPr>
   </w:style>
-  <w:style w:type="paragraph" w:styleId="915">
+  <w:style w:type="paragraph" w:styleId="1009">
     <w:name w:val="No Spacing"/>
-    <w:basedOn w:val="912"/>
+    <w:basedOn w:val="1006"/>
     <w:uiPriority w:val="1"/>
     <w:qFormat/>
     <w:pPr>
@@ -44341,9 +44350,9 @@
       <w:ind/>
     </w:pPr>
   </w:style>
-  <w:style w:type="paragraph" w:styleId="916">
+  <w:style w:type="paragraph" w:styleId="1010">
     <w:name w:val="List Paragraph"/>
-    <w:basedOn w:val="912"/>
+    <w:basedOn w:val="1006"/>
     <w:uiPriority w:val="34"/>
     <w:qFormat/>
     <w:pPr>

</xml_diff>